<commit_message>
Fix Pi timeout judgement cleanup
</commit_message>
<xml_diff>
--- a/docs/reports/02B-Pi工具与任务数据.docx
+++ b/docs/reports/02B-Pi工具与任务数据.docx
@@ -12,7 +12,7 @@
     </w:p>
     <w:p>
       <w:r>
-        <w:t>更新：2026-10-03T00:12:24+08:00。本册按实际实验整理，原始运行记录单独保存。</w:t>
+        <w:t>更新：2026-10-03T02:08:15+08:00。本册按实际实验整理，原始运行记录单独保存。</w:t>
       </w:r>
     </w:p>
     <w:p>
@@ -75,7 +75,7 @@
         <w:t>F:/workspace/...</w:t>
       </w:r>
       <w:r>
-        <w:t>规范化路径完成隔离write/read往返；正式dev仍按冻结的16题评测。</w:t>
+        <w:t>规范化路径完成隔离write/read往返。R25记录了16/16条、观察通过0/16；其中8条超时任务在判分前沙箱已被清理，整轮不作可比模型成绩，冻结分母仍为16。</w:t>
       </w:r>
     </w:p>
     <w:p>
@@ -6560,6 +6560,26 @@
     </w:p>
     <w:p>
       <w:r>
+        <w:t>Pi dev记录0/16个观察通过；8/16条超时任务在判分前沙箱已被清理，整轮不作为可比模型成绩，原定分母仍为16。</w:t>
+      </w:r>
+    </w:p>
+    <w:p>
+      <w:r>
+        <w:t>原始调用记录还显示模型反复读取</w:t>
+      </w:r>
+      <w:r>
+        <w:rPr>
+          <w:rFonts w:ascii="Consolas" w:hAnsi="Consolas"/>
+          <w:sz w:val="20"/>
+        </w:rPr>
+        <w:t>F:/workspace/README.md</w:t>
+      </w:r>
+      <w:r>
+        <w:t>并耗尽12次工具预算；0/16是本轮原始观测值，不作为有效迁移成绩。</w:t>
+      </w:r>
+    </w:p>
+    <w:p>
+      <w:r>
         <w:t>公开dev的轨迹通过数、Pi任务完成数和token loss回答的是不同问题，不能互相替代。规则参考本身不是Agent成绩；具体错误要回到工具调用、返回和最终文件状态判断。</w:t>
       </w:r>
     </w:p>
@@ -6596,6 +6616,21 @@
           <w:sz w:val="20"/>
         </w:rPr>
         <w:t>experiments/E14/runs/E14-R23.json</w:t>
+      </w:r>
+      <w:r>
+        <w:t>。</w:t>
+      </w:r>
+    </w:p>
+    <w:p>
+      <w:r>
+        <w:t>- E14-R25：dev观察通过0/16；8条超时任务判分时容器已被清理，整轮不作为可比模型成绩；记录：</w:t>
+      </w:r>
+      <w:r>
+        <w:rPr>
+          <w:rFonts w:ascii="Consolas" w:hAnsi="Consolas"/>
+          <w:sz w:val="20"/>
+        </w:rPr>
+        <w:t>experiments/E14/runs/E14-R25.json</w:t>
       </w:r>
       <w:r>
         <w:t>。</w:t>
@@ -6725,6 +6760,37 @@
             </w:pPr>
             <w:r>
               <w:t>experiments/E14/runs/E14-R21.json；experiments/E14/runs/E14-R23.json</w:t>
+            </w:r>
+          </w:p>
+        </w:tc>
+      </w:tr>
+      <w:tr>
+        <w:trPr>
+          <w:cantSplit/>
+        </w:trPr>
+        <w:tc>
+          <w:tcPr>
+            <w:tcW w:type="dxa" w:w="2381"/>
+          </w:tcPr>
+          <w:p>
+            <w:pPr>
+              <w:spacing w:after="40" w:line="240" w:lineRule="auto"/>
+            </w:pPr>
+            <w:r>
+              <w:t>Pi Agent dev计时竞态运行（不计模型成绩）</w:t>
+            </w:r>
+          </w:p>
+        </w:tc>
+        <w:tc>
+          <w:tcPr>
+            <w:tcW w:type="dxa" w:w="7200"/>
+          </w:tcPr>
+          <w:p>
+            <w:pPr>
+              <w:spacing w:after="40" w:line="240" w:lineRule="auto"/>
+            </w:pPr>
+            <w:r>
+              <w:t>experiments/E14/runs/E14-R25.json；scripts/pi_agent_eval.mjs；scripts/pi_sandbox.mjs</w:t>
             </w:r>
           </w:p>
         </w:tc>

</xml_diff>

<commit_message>
Record E14-R26 Pi dev result
</commit_message>
<xml_diff>
--- a/docs/reports/02B-Pi工具与任务数据.docx
+++ b/docs/reports/02B-Pi工具与任务数据.docx
@@ -12,7 +12,7 @@
     </w:p>
     <w:p>
       <w:r>
-        <w:t>更新：2026-10-03T02:08:15+08:00。本册按实际实验整理，原始运行记录单独保存。</w:t>
+        <w:t>更新：2026-10-03T04:05:15+08:00。本册按实际实验整理，原始运行记录单独保存。</w:t>
       </w:r>
     </w:p>
     <w:p>
@@ -75,7 +75,7 @@
         <w:t>F:/workspace/...</w:t>
       </w:r>
       <w:r>
-        <w:t>规范化路径完成隔离write/read往返。R25记录了16/16条、观察通过0/16；其中8条超时任务在判分前沙箱已被清理，整轮不作可比模型成绩，冻结分母仍为16。</w:t>
+        <w:t>规范化路径完成隔离write/read往返。R25记录了16/16条、观察通过0/16；其中8条超时任务在判分前沙箱已被清理，整轮不作可比模型成绩，冻结分母仍为16。R26对冻结的16题完整判分，观察通过0/16；14题超时，另2题结束后仍未通过，耗时4,606秒。16个容器均已回收，调用ID与工具返回逐条匹配，未再出现容器清理判分故障；412次工具请求中，220次因每题12次执行上限被沙箱拒绝。</w:t>
       </w:r>
     </w:p>
     <w:p>
@@ -6580,6 +6580,16 @@
     </w:p>
     <w:p>
       <w:r>
+        <w:t>Pi dev：0/16个任务通过；超时、截断或工具错误都留在预定分母中。</w:t>
+      </w:r>
+    </w:p>
+    <w:p>
+      <w:r>
+        <w:t>E14-R26耗时4606秒；14/16个任务超时，2个未超时任务仍未通过。记录412次工具请求，其中220次因12次调用上限被沙箱拒绝。</w:t>
+      </w:r>
+    </w:p>
+    <w:p>
+      <w:r>
         <w:t>公开dev的轨迹通过数、Pi任务完成数和token loss回答的是不同问题，不能互相替代。规则参考本身不是Agent成绩；具体错误要回到工具调用、返回和最终文件状态判断。</w:t>
       </w:r>
     </w:p>
@@ -6631,6 +6641,21 @@
           <w:sz w:val="20"/>
         </w:rPr>
         <w:t>experiments/E14/runs/E14-R25.json</w:t>
+      </w:r>
+      <w:r>
+        <w:t>。</w:t>
+      </w:r>
+    </w:p>
+    <w:p>
+      <w:r>
+        <w:t>- E14-R26：dev 0/16，14/16个任务超时；记录：</w:t>
+      </w:r>
+      <w:r>
+        <w:rPr>
+          <w:rFonts w:ascii="Consolas" w:hAnsi="Consolas"/>
+          <w:sz w:val="20"/>
+        </w:rPr>
+        <w:t>experiments/E14/runs/E14-R26.json</w:t>
       </w:r>
       <w:r>
         <w:t>。</w:t>
@@ -6791,6 +6816,37 @@
             </w:pPr>
             <w:r>
               <w:t>experiments/E14/runs/E14-R25.json；scripts/pi_agent_eval.mjs；scripts/pi_sandbox.mjs</w:t>
+            </w:r>
+          </w:p>
+        </w:tc>
+      </w:tr>
+      <w:tr>
+        <w:trPr>
+          <w:cantSplit/>
+        </w:trPr>
+        <w:tc>
+          <w:tcPr>
+            <w:tcW w:type="dxa" w:w="2381"/>
+          </w:tcPr>
+          <w:p>
+            <w:pPr>
+              <w:spacing w:after="40" w:line="240" w:lineRule="auto"/>
+            </w:pPr>
+            <w:r>
+              <w:t>Pi Agent固定dev16完整评测</w:t>
+            </w:r>
+          </w:p>
+        </w:tc>
+        <w:tc>
+          <w:tcPr>
+            <w:tcW w:type="dxa" w:w="7200"/>
+          </w:tcPr>
+          <w:p>
+            <w:pPr>
+              <w:spacing w:after="40" w:line="240" w:lineRule="auto"/>
+            </w:pPr>
+            <w:r>
+              <w:t>experiments/E14/runs/E14-R26.json；configs/pi-agent-e14-dev.json；scripts/pi_agent_eval.mjs；scripts/pi_sandbox.mjs</w:t>
             </w:r>
           </w:p>
         </w:tc>

</xml_diff>

<commit_message>
Record E14 frozen Pi test evaluation
</commit_message>
<xml_diff>
--- a/docs/reports/02B-Pi工具与任务数据.docx
+++ b/docs/reports/02B-Pi工具与任务数据.docx
@@ -12,7 +12,7 @@
     </w:p>
     <w:p>
       <w:r>
-        <w:t>更新：2026-10-03T04:05:15+08:00。本册按实际实验整理，原始运行记录单独保存。</w:t>
+        <w:t>更新：2026-10-03T07:56:11+08:00。本册按实际实验整理，原始运行记录单独保存。</w:t>
       </w:r>
     </w:p>
     <w:p>
@@ -75,7 +75,7 @@
         <w:t>F:/workspace/...</w:t>
       </w:r>
       <w:r>
-        <w:t>规范化路径完成隔离write/read往返。R25记录了16/16条、观察通过0/16；其中8条超时任务在判分前沙箱已被清理，整轮不作可比模型成绩，冻结分母仍为16。R26对冻结的16题完整判分，观察通过0/16；14题超时，另2题结束后仍未通过，耗时4,606秒。16个容器均已回收，调用ID与工具返回逐条匹配，未再出现容器清理判分故障；412次工具请求中，220次因每题12次执行上限被沙箱拒绝。</w:t>
+        <w:t>规范化路径完成隔离write/read往返。修正后的固定dev16评测R26通过0/16，冻结test40评测R27通过0/40。</w:t>
       </w:r>
     </w:p>
     <w:p>
@@ -6590,6 +6590,31 @@
     </w:p>
     <w:p>
       <w:r>
+        <w:t>Pi test：0/40个任务通过；超时、截断或工具错误都留在预定分母中。</w:t>
+      </w:r>
+    </w:p>
+    <w:p>
+      <w:r>
+        <w:t>E14-R27耗时11324秒；37/40个任务超时，3个未超时任务仍未通过。记录953次工具请求，其中490次因12次调用上限被沙箱拒绝。</w:t>
+      </w:r>
+    </w:p>
+    <w:p>
+      <w:r>
+        <w:t>E14-R27的40条任务结果与汇总已写入后，运行器在最终进度收尾时报</w:t>
+      </w:r>
+      <w:r>
+        <w:rPr>
+          <w:rFonts w:ascii="Consolas" w:hAnsi="Consolas"/>
+          <w:sz w:val="20"/>
+        </w:rPr>
+        <w:t>ReferenceError</w:t>
+      </w:r>
+      <w:r>
+        <w:t>并退出1；该异常不改变40/40已评、0/40通过的结果。收尾字段现改用冻结配置中的任务数并完成语法核验，未重跑模型。</w:t>
+      </w:r>
+    </w:p>
+    <w:p>
+      <w:r>
         <w:t>公开dev的轨迹通过数、Pi任务完成数和token loss回答的是不同问题，不能互相替代。规则参考本身不是Agent成绩；具体错误要回到工具调用、返回和最终文件状态判断。</w:t>
       </w:r>
     </w:p>
@@ -6663,6 +6688,21 @@
     </w:p>
     <w:p>
       <w:r>
+        <w:t>- E14-R27：test 0/40，37/40个任务超时；记录：</w:t>
+      </w:r>
+      <w:r>
+        <w:rPr>
+          <w:rFonts w:ascii="Consolas" w:hAnsi="Consolas"/>
+          <w:sz w:val="20"/>
+        </w:rPr>
+        <w:t>experiments/E14/runs/E14-R27.json</w:t>
+      </w:r>
+      <w:r>
+        <w:t>。</w:t>
+      </w:r>
+    </w:p>
+    <w:p>
+      <w:r>
         <w:t>Pi 路径映射核验（E14-R24）：Pi 会话和 SessionManager 均使用</w:t>
       </w:r>
       <w:r>
@@ -6771,7 +6811,7 @@
               <w:spacing w:after="40" w:line="240" w:lineRule="auto"/>
             </w:pPr>
             <w:r>
-              <w:t>Pi Agent dev无效接线记录（不计模型成绩）</w:t>
+              <w:t>Pi 实际工具定义与容器参数</w:t>
             </w:r>
           </w:p>
         </w:tc>
@@ -6784,7 +6824,7 @@
               <w:spacing w:after="40" w:line="240" w:lineRule="auto"/>
             </w:pPr>
             <w:r>
-              <w:t>experiments/E14/runs/E14-R21.json；experiments/E14/runs/E14-R23.json</w:t>
+              <w:t>configs/pi-tools.json；configs/pi-sandbox.json</w:t>
             </w:r>
           </w:p>
         </w:tc>
@@ -6802,7 +6842,7 @@
               <w:spacing w:after="40" w:line="240" w:lineRule="auto"/>
             </w:pPr>
             <w:r>
-              <w:t>Pi Agent dev计时竞态运行（不计模型成绩）</w:t>
+              <w:t>Pi 工具适配与核验入口</w:t>
             </w:r>
           </w:p>
         </w:tc>
@@ -6815,7 +6855,7 @@
               <w:spacing w:after="40" w:line="240" w:lineRule="auto"/>
             </w:pPr>
             <w:r>
-              <w:t>experiments/E14/runs/E14-R25.json；scripts/pi_agent_eval.mjs；scripts/pi_sandbox.mjs</w:t>
+              <w:t>scripts/pi_sandbox.mjs；scripts/pi_tools_probe.mjs</w:t>
             </w:r>
           </w:p>
         </w:tc>
@@ -6833,7 +6873,7 @@
               <w:spacing w:after="40" w:line="240" w:lineRule="auto"/>
             </w:pPr>
             <w:r>
-              <w:t>Pi Agent固定dev16完整评测</w:t>
+              <w:t>Pi 工具链准备</w:t>
             </w:r>
           </w:p>
         </w:tc>
@@ -6846,7 +6886,7 @@
               <w:spacing w:after="40" w:line="240" w:lineRule="auto"/>
             </w:pPr>
             <w:r>
-              <w:t>experiments/E14/runs/E14-R26.json；configs/pi-agent-e14-dev.json；scripts/pi_agent_eval.mjs；scripts/pi_sandbox.mjs</w:t>
+              <w:t>experiments/E13/preparation.json；experiments/E13/notes.md</w:t>
             </w:r>
           </w:p>
         </w:tc>
@@ -6864,7 +6904,7 @@
               <w:spacing w:after="40" w:line="240" w:lineRule="auto"/>
             </w:pPr>
             <w:r>
-              <w:t>Pi 实际工具定义与容器参数</w:t>
+              <w:t>Pi 任务参考与判据核验</w:t>
             </w:r>
           </w:p>
         </w:tc>
@@ -6877,7 +6917,7 @@
               <w:spacing w:after="40" w:line="240" w:lineRule="auto"/>
             </w:pPr>
             <w:r>
-              <w:t>configs/pi-tools.json；configs/pi-sandbox.json</w:t>
+              <w:t>experiments/E14/runs/E14-R01.json；experiments/E14/reference-calls.csv；experiments/E14/reference-events.jsonl</w:t>
             </w:r>
           </w:p>
         </w:tc>
@@ -6895,7 +6935,7 @@
               <w:spacing w:after="40" w:line="240" w:lineRule="auto"/>
             </w:pPr>
             <w:r>
-              <w:t>Pi 工具适配与核验入口</w:t>
+              <w:t>Pi 训练任务原型与核验入口</w:t>
             </w:r>
           </w:p>
         </w:tc>
@@ -6908,7 +6948,7 @@
               <w:spacing w:after="40" w:line="240" w:lineRule="auto"/>
             </w:pPr>
             <w:r>
-              <w:t>scripts/pi_sandbox.mjs；scripts/pi_tools_probe.mjs</w:t>
+              <w:t>configs/pi-task-catalog.json；scripts/pi_tasks.mjs；scripts/pi_task_probe.mjs</w:t>
             </w:r>
           </w:p>
         </w:tc>
@@ -6926,7 +6966,7 @@
               <w:spacing w:after="40" w:line="240" w:lineRule="auto"/>
             </w:pPr>
             <w:r>
-              <w:t>Pi 工具链准备</w:t>
+              <w:t>Pi 多轮训练格式与监督检查</w:t>
             </w:r>
           </w:p>
         </w:tc>
@@ -6939,7 +6979,7 @@
               <w:spacing w:after="40" w:line="240" w:lineRule="auto"/>
             </w:pPr>
             <w:r>
-              <w:t>experiments/E13/preparation.json；experiments/E13/notes.md</w:t>
+              <w:t>configs/pi-reference-data.json；scripts/pi_reference_data.py；experiments/E14/runs/E14-R02.json；experiments/E14/current-reply-mask.csv</w:t>
             </w:r>
           </w:p>
         </w:tc>
@@ -6957,7 +6997,7 @@
               <w:spacing w:after="40" w:line="240" w:lineRule="auto"/>
             </w:pPr>
             <w:r>
-              <w:t>Pi 任务参考与判据核验</w:t>
+              <w:t>Pi 新增模板与错误方案</w:t>
             </w:r>
           </w:p>
         </w:tc>
@@ -6970,7 +7010,7 @@
               <w:spacing w:after="40" w:line="240" w:lineRule="auto"/>
             </w:pPr>
             <w:r>
-              <w:t>experiments/E14/runs/E14-R01.json；experiments/E14/reference-calls.csv；experiments/E14/reference-events.jsonl</w:t>
+              <w:t>scripts/pi_tasks_extended.mjs；experiments/E14/runs/E14-R03.json；experiments/E14/extension-calls.csv；experiments/E14/extension-events.jsonl</w:t>
             </w:r>
           </w:p>
         </w:tc>
@@ -6988,7 +7028,7 @@
               <w:spacing w:after="40" w:line="240" w:lineRule="auto"/>
             </w:pPr>
             <w:r>
-              <w:t>Pi 训练任务原型与核验入口</w:t>
+              <w:t>Pi 新增参考的训练格式</w:t>
             </w:r>
           </w:p>
         </w:tc>
@@ -7001,7 +7041,7 @@
               <w:spacing w:after="40" w:line="240" w:lineRule="auto"/>
             </w:pPr>
             <w:r>
-              <w:t>configs/pi-task-catalog.json；scripts/pi_tasks.mjs；scripts/pi_task_probe.mjs</w:t>
+              <w:t>configs/pi-reference-extension.json；experiments/E14/runs/E14-R04.json</w:t>
             </w:r>
           </w:p>
         </w:tc>
@@ -7019,7 +7059,7 @@
               <w:spacing w:after="40" w:line="240" w:lineRule="auto"/>
             </w:pPr>
             <w:r>
-              <w:t>Pi 多轮训练格式与监督检查</w:t>
+              <w:t>Pi 训练场景与批量参考入口</w:t>
             </w:r>
           </w:p>
         </w:tc>
@@ -7032,7 +7072,7 @@
               <w:spacing w:after="40" w:line="240" w:lineRule="auto"/>
             </w:pPr>
             <w:r>
-              <w:t>configs/pi-reference-data.json；scripts/pi_reference_data.py；experiments/E14/runs/E14-R02.json；experiments/E14/current-reply-mask.csv</w:t>
+              <w:t>configs/pi-task-data.json；configs/pi-reference-batch.json；scripts/pi_task_data.py；scripts/pi_reference_batch.mjs</w:t>
             </w:r>
           </w:p>
         </w:tc>
@@ -7050,7 +7090,7 @@
               <w:spacing w:after="40" w:line="240" w:lineRule="auto"/>
             </w:pPr>
             <w:r>
-              <w:t>Pi 新增模板与错误方案</w:t>
+              <w:t>Pi 场景去重与失败记录</w:t>
             </w:r>
           </w:p>
         </w:tc>
@@ -7063,7 +7103,7 @@
               <w:spacing w:after="40" w:line="240" w:lineRule="auto"/>
             </w:pPr>
             <w:r>
-              <w:t>scripts/pi_tasks_extended.mjs；experiments/E14/runs/E14-R03.json；experiments/E14/extension-calls.csv；experiments/E14/extension-events.jsonl</w:t>
+              <w:t>experiments/E14/scene-generation-audit.json；experiments/E14/runs/E14-R05.json；experiments/E14/runs/E14-R06.json；experiments/E14/runs/E14-R07.json</w:t>
             </w:r>
           </w:p>
         </w:tc>
@@ -7081,7 +7121,7 @@
               <w:spacing w:after="40" w:line="240" w:lineRule="auto"/>
             </w:pPr>
             <w:r>
-              <w:t>Pi 新增参考的训练格式</w:t>
+              <w:t>Pi dev任务与判据核验</w:t>
             </w:r>
           </w:p>
         </w:tc>
@@ -7094,7 +7134,7 @@
               <w:spacing w:after="40" w:line="240" w:lineRule="auto"/>
             </w:pPr>
             <w:r>
-              <w:t>configs/pi-reference-extension.json；experiments/E14/runs/E14-R04.json</w:t>
+              <w:t>configs/pi-dev-tasks.json；scripts/pi_tasks_dev.mjs；scripts/pi_dev_probe.mjs；experiments/E14/runs/E14-R09.json</w:t>
             </w:r>
           </w:p>
         </w:tc>
@@ -7112,7 +7152,7 @@
               <w:spacing w:after="40" w:line="240" w:lineRule="auto"/>
             </w:pPr>
             <w:r>
-              <w:t>Pi 训练场景与批量参考入口</w:t>
+              <w:t>Pi dev参考历史长度</w:t>
             </w:r>
           </w:p>
         </w:tc>
@@ -7125,7 +7165,7 @@
               <w:spacing w:after="40" w:line="240" w:lineRule="auto"/>
             </w:pPr>
             <w:r>
-              <w:t>configs/pi-task-data.json；configs/pi-reference-batch.json；scripts/pi_task_data.py；scripts/pi_reference_batch.mjs</w:t>
+              <w:t>scripts/pi_dev_lengths.py；experiments/E14/runs/E14-R10.json；experiments/E14/dev-lengths.csv</w:t>
             </w:r>
           </w:p>
         </w:tc>
@@ -7143,7 +7183,7 @@
               <w:spacing w:after="40" w:line="240" w:lineRule="auto"/>
             </w:pPr>
             <w:r>
-              <w:t>Pi 场景去重与失败记录</w:t>
+              <w:t>Pi dev逐条结果与划分复核</w:t>
             </w:r>
           </w:p>
         </w:tc>
@@ -7156,7 +7196,7 @@
               <w:spacing w:after="40" w:line="240" w:lineRule="auto"/>
             </w:pPr>
             <w:r>
-              <w:t>experiments/E14/scene-generation-audit.json；experiments/E14/runs/E14-R05.json；experiments/E14/runs/E14-R06.json；experiments/E14/runs/E14-R07.json</w:t>
+              <w:t>experiments/E14/dev-reference.csv；experiments/E14/dev-audit.json</w:t>
             </w:r>
           </w:p>
         </w:tc>
@@ -7174,7 +7214,7 @@
               <w:spacing w:after="40" w:line="240" w:lineRule="auto"/>
             </w:pPr>
             <w:r>
-              <w:t>Pi dev任务与判据核验</w:t>
+              <w:t>Pi 1000条实际规则参考</w:t>
             </w:r>
           </w:p>
         </w:tc>
@@ -7187,7 +7227,7 @@
               <w:spacing w:after="40" w:line="240" w:lineRule="auto"/>
             </w:pPr>
             <w:r>
-              <w:t>configs/pi-dev-tasks.json；scripts/pi_tasks_dev.mjs；scripts/pi_dev_probe.mjs；experiments/E14/runs/E14-R09.json</w:t>
+              <w:t>experiments/E14/runs/E14-R08.json；experiments/E14/batch-reference.csv；experiments/E14/batch-audit.json</w:t>
             </w:r>
           </w:p>
         </w:tc>
@@ -7205,7 +7245,7 @@
               <w:spacing w:after="40" w:line="240" w:lineRule="auto"/>
             </w:pPr>
             <w:r>
-              <w:t>Pi dev参考历史长度</w:t>
+              <w:t>Pi 1000条参考训练格式</w:t>
             </w:r>
           </w:p>
         </w:tc>
@@ -7218,7 +7258,7 @@
               <w:spacing w:after="40" w:line="240" w:lineRule="auto"/>
             </w:pPr>
             <w:r>
-              <w:t>scripts/pi_dev_lengths.py；experiments/E14/runs/E14-R10.json；experiments/E14/dev-lengths.csv</w:t>
+              <w:t>scripts/pi_reference_data.py；experiments/E14/runs/E14-R11.json</w:t>
             </w:r>
           </w:p>
         </w:tc>
@@ -7236,7 +7276,7 @@
               <w:spacing w:after="40" w:line="240" w:lineRule="auto"/>
             </w:pPr>
             <w:r>
-              <w:t>Pi dev逐条结果与划分复核</w:t>
+              <w:t>Pi train/dev近似重复筛查</w:t>
             </w:r>
           </w:p>
         </w:tc>
@@ -7249,7 +7289,7 @@
               <w:spacing w:after="40" w:line="240" w:lineRule="auto"/>
             </w:pPr>
             <w:r>
-              <w:t>experiments/E14/dev-reference.csv；experiments/E14/dev-audit.json</w:t>
+              <w:t>scripts/pi_split_inspect.py；experiments/E14/runs/E14-R12.json</w:t>
             </w:r>
           </w:p>
         </w:tc>
@@ -7267,7 +7307,7 @@
               <w:spacing w:after="40" w:line="240" w:lineRule="auto"/>
             </w:pPr>
             <w:r>
-              <w:t>Pi 1000条实际规则参考</w:t>
+              <w:t>Pi test任务与判据核验</w:t>
             </w:r>
           </w:p>
         </w:tc>
@@ -7280,7 +7320,7 @@
               <w:spacing w:after="40" w:line="240" w:lineRule="auto"/>
             </w:pPr>
             <w:r>
-              <w:t>experiments/E14/runs/E14-R08.json；experiments/E14/batch-reference.csv；experiments/E14/batch-audit.json</w:t>
+              <w:t>configs/pi-test-tasks.json；scripts/pi_tasks_test.mjs；scripts/pi_eval_tasks.mjs；experiments/E14/runs/E14-R14.json</w:t>
             </w:r>
           </w:p>
         </w:tc>
@@ -7298,7 +7338,7 @@
               <w:spacing w:after="40" w:line="240" w:lineRule="auto"/>
             </w:pPr>
             <w:r>
-              <w:t>Pi 1000条参考训练格式</w:t>
+              <w:t>Pi test逐条结果与归档复核</w:t>
             </w:r>
           </w:p>
         </w:tc>
@@ -7311,7 +7351,7 @@
               <w:spacing w:after="40" w:line="240" w:lineRule="auto"/>
             </w:pPr>
             <w:r>
-              <w:t>scripts/pi_reference_data.py；experiments/E14/runs/E14-R11.json</w:t>
+              <w:t>experiments/E14/test-reference.csv；experiments/E14/test-audit.json</w:t>
             </w:r>
           </w:p>
         </w:tc>
@@ -7329,7 +7369,7 @@
               <w:spacing w:after="40" w:line="240" w:lineRule="auto"/>
             </w:pPr>
             <w:r>
-              <w:t>Pi train/dev近似重复筛查</w:t>
+              <w:t>Pi test参考历史长度</w:t>
             </w:r>
           </w:p>
         </w:tc>
@@ -7342,7 +7382,7 @@
               <w:spacing w:after="40" w:line="240" w:lineRule="auto"/>
             </w:pPr>
             <w:r>
-              <w:t>scripts/pi_split_inspect.py；experiments/E14/runs/E14-R12.json</w:t>
+              <w:t>scripts/pi_eval_lengths.py；experiments/E14/runs/E14-R15.json；experiments/E14/test-lengths.csv</w:t>
             </w:r>
           </w:p>
         </w:tc>
@@ -7360,7 +7400,7 @@
               <w:spacing w:after="40" w:line="240" w:lineRule="auto"/>
             </w:pPr>
             <w:r>
-              <w:t>Pi test任务与判据核验</w:t>
+              <w:t>Pi test与train/dev划分筛查</w:t>
             </w:r>
           </w:p>
         </w:tc>
@@ -7373,7 +7413,7 @@
               <w:spacing w:after="40" w:line="240" w:lineRule="auto"/>
             </w:pPr>
             <w:r>
-              <w:t>configs/pi-test-tasks.json；scripts/pi_tasks_test.mjs；scripts/pi_eval_tasks.mjs；experiments/E14/runs/E14-R14.json</w:t>
+              <w:t>scripts/pi_split_inspect.py；experiments/E14/runs/E14-R16.json</w:t>
             </w:r>
           </w:p>
         </w:tc>
@@ -7391,7 +7431,7 @@
               <w:spacing w:after="40" w:line="240" w:lineRule="auto"/>
             </w:pPr>
             <w:r>
-              <w:t>Pi test逐条结果与归档复核</w:t>
+              <w:t>Pi test生成失败记录</w:t>
             </w:r>
           </w:p>
         </w:tc>
@@ -7404,7 +7444,7 @@
               <w:spacing w:after="40" w:line="240" w:lineRule="auto"/>
             </w:pPr>
             <w:r>
-              <w:t>experiments/E14/test-reference.csv；experiments/E14/test-audit.json</w:t>
+              <w:t>experiments/E14/runs/E14-R13.json</w:t>
             </w:r>
           </w:p>
         </w:tc>
@@ -7422,7 +7462,7 @@
               <w:spacing w:after="40" w:line="240" w:lineRule="auto"/>
             </w:pPr>
             <w:r>
-              <w:t>Pi test参考历史长度</w:t>
+              <w:t>Pi 领域混合来源哈希失败与修正</w:t>
             </w:r>
           </w:p>
         </w:tc>
@@ -7435,7 +7475,7 @@
               <w:spacing w:after="40" w:line="240" w:lineRule="auto"/>
             </w:pPr>
             <w:r>
-              <w:t>scripts/pi_eval_lengths.py；experiments/E14/runs/E14-R15.json；experiments/E14/test-lengths.csv</w:t>
+              <w:t>experiments/E14/runs/E14-R17.json；configs/domain-mix.json</w:t>
             </w:r>
           </w:p>
         </w:tc>
@@ -7453,7 +7493,7 @@
               <w:spacing w:after="40" w:line="240" w:lineRule="auto"/>
             </w:pPr>
             <w:r>
-              <w:t>Pi test与train/dev划分筛查</w:t>
+              <w:t>Pi 512+512冻结清单与数据构建</w:t>
             </w:r>
           </w:p>
         </w:tc>
@@ -7466,7 +7506,7 @@
               <w:spacing w:after="40" w:line="240" w:lineRule="auto"/>
             </w:pPr>
             <w:r>
-              <w:t>scripts/pi_split_inspect.py；experiments/E14/runs/E14-R16.json</w:t>
+              <w:t>scripts/domain_mix.py；configs/domain-mix-frozen.json；experiments/E14/runs/E14-R18.json</w:t>
             </w:r>
           </w:p>
         </w:tc>
@@ -7484,7 +7524,7 @@
               <w:spacing w:after="40" w:line="240" w:lineRule="auto"/>
             </w:pPr>
             <w:r>
-              <w:t>Pi test生成失败记录</w:t>
+              <w:t>Pi 领域微调及固定公开dev</w:t>
             </w:r>
           </w:p>
         </w:tc>
@@ -7497,7 +7537,7 @@
               <w:spacing w:after="40" w:line="240" w:lineRule="auto"/>
             </w:pPr>
             <w:r>
-              <w:t>experiments/E14/runs/E14-R13.json</w:t>
+              <w:t>configs/sft-domain.json；configs/offline-eval-domain.json；configs/scale-domain.json</w:t>
             </w:r>
           </w:p>
         </w:tc>
@@ -7515,7 +7555,7 @@
               <w:spacing w:after="40" w:line="240" w:lineRule="auto"/>
             </w:pPr>
             <w:r>
-              <w:t>Pi 领域混合来源哈希失败与修正</w:t>
+              <w:t>Pi 路径映射隔离烟测（不含模型推理）</w:t>
             </w:r>
           </w:p>
         </w:tc>
@@ -7528,7 +7568,7 @@
               <w:spacing w:after="40" w:line="240" w:lineRule="auto"/>
             </w:pPr>
             <w:r>
-              <w:t>experiments/E14/runs/E14-R17.json；configs/domain-mix.json</w:t>
+              <w:t>scripts/pi_path_smoke.mjs；experiments/E14/runs/E14-R22.json；experiments/E14/runs/E14-R24.json</w:t>
             </w:r>
           </w:p>
         </w:tc>
@@ -7546,7 +7586,7 @@
               <w:spacing w:after="40" w:line="240" w:lineRule="auto"/>
             </w:pPr>
             <w:r>
-              <w:t>Pi 512+512冻结清单与数据构建</w:t>
+              <w:t>Pi Agent dev16与test40评测及容器时序核验</w:t>
             </w:r>
           </w:p>
         </w:tc>
@@ -7559,162 +7599,7 @@
               <w:spacing w:after="40" w:line="240" w:lineRule="auto"/>
             </w:pPr>
             <w:r>
-              <w:t>scripts/domain_mix.py；configs/domain-mix-frozen.json；experiments/E14/runs/E14-R18.json</w:t>
-            </w:r>
-          </w:p>
-        </w:tc>
-      </w:tr>
-      <w:tr>
-        <w:trPr>
-          <w:cantSplit/>
-        </w:trPr>
-        <w:tc>
-          <w:tcPr>
-            <w:tcW w:type="dxa" w:w="2381"/>
-          </w:tcPr>
-          <w:p>
-            <w:pPr>
-              <w:spacing w:after="40" w:line="240" w:lineRule="auto"/>
-            </w:pPr>
-            <w:r>
-              <w:t>Pi 领域微调及固定公开dev</w:t>
-            </w:r>
-          </w:p>
-        </w:tc>
-        <w:tc>
-          <w:tcPr>
-            <w:tcW w:type="dxa" w:w="7200"/>
-          </w:tcPr>
-          <w:p>
-            <w:pPr>
-              <w:spacing w:after="40" w:line="240" w:lineRule="auto"/>
-            </w:pPr>
-            <w:r>
-              <w:t>configs/sft-domain.json；configs/offline-eval-domain.json；configs/scale-domain.json</w:t>
-            </w:r>
-          </w:p>
-        </w:tc>
-      </w:tr>
-      <w:tr>
-        <w:trPr>
-          <w:cantSplit/>
-        </w:trPr>
-        <w:tc>
-          <w:tcPr>
-            <w:tcW w:type="dxa" w:w="2381"/>
-          </w:tcPr>
-          <w:p>
-            <w:pPr>
-              <w:spacing w:after="40" w:line="240" w:lineRule="auto"/>
-            </w:pPr>
-            <w:r>
-              <w:t>Pi 接线失败运行（不计模型成绩）</w:t>
-            </w:r>
-          </w:p>
-        </w:tc>
-        <w:tc>
-          <w:tcPr>
-            <w:tcW w:type="dxa" w:w="7200"/>
-          </w:tcPr>
-          <w:p>
-            <w:pPr>
-              <w:spacing w:after="40" w:line="240" w:lineRule="auto"/>
-            </w:pPr>
-            <w:r>
-              <w:t>experiments/E14/runs/E14-R21.json</w:t>
-            </w:r>
-          </w:p>
-        </w:tc>
-      </w:tr>
-      <w:tr>
-        <w:trPr>
-          <w:cantSplit/>
-        </w:trPr>
-        <w:tc>
-          <w:tcPr>
-            <w:tcW w:type="dxa" w:w="2381"/>
-          </w:tcPr>
-          <w:p>
-            <w:pPr>
-              <w:spacing w:after="40" w:line="240" w:lineRule="auto"/>
-            </w:pPr>
-            <w:r>
-              <w:t>Pi 第二次接线失败运行（不计模型成绩）</w:t>
-            </w:r>
-          </w:p>
-        </w:tc>
-        <w:tc>
-          <w:tcPr>
-            <w:tcW w:type="dxa" w:w="7200"/>
-          </w:tcPr>
-          <w:p>
-            <w:pPr>
-              <w:spacing w:after="40" w:line="240" w:lineRule="auto"/>
-            </w:pPr>
-            <w:r>
-              <w:t>experiments/E14/runs/E14-R23.json</w:t>
-            </w:r>
-          </w:p>
-        </w:tc>
-      </w:tr>
-      <w:tr>
-        <w:trPr>
-          <w:cantSplit/>
-        </w:trPr>
-        <w:tc>
-          <w:tcPr>
-            <w:tcW w:type="dxa" w:w="2381"/>
-          </w:tcPr>
-          <w:p>
-            <w:pPr>
-              <w:spacing w:after="40" w:line="240" w:lineRule="auto"/>
-            </w:pPr>
-            <w:r>
-              <w:t>Pi 会话路径映射烟测（不含模型推理）</w:t>
-            </w:r>
-          </w:p>
-        </w:tc>
-        <w:tc>
-          <w:tcPr>
-            <w:tcW w:type="dxa" w:w="7200"/>
-          </w:tcPr>
-          <w:p>
-            <w:pPr>
-              <w:spacing w:after="40" w:line="240" w:lineRule="auto"/>
-            </w:pPr>
-            <w:r>
-              <w:t>scripts/pi_path_smoke.mjs；experiments/E14/runs/E14-R22.json</w:t>
-            </w:r>
-          </w:p>
-        </w:tc>
-      </w:tr>
-      <w:tr>
-        <w:trPr>
-          <w:cantSplit/>
-        </w:trPr>
-        <w:tc>
-          <w:tcPr>
-            <w:tcW w:type="dxa" w:w="2381"/>
-          </w:tcPr>
-          <w:p>
-            <w:pPr>
-              <w:spacing w:after="40" w:line="240" w:lineRule="auto"/>
-            </w:pPr>
-            <w:r>
-              <w:t>Pi Windows规范化路径烟测（不含模型推理）</w:t>
-            </w:r>
-          </w:p>
-        </w:tc>
-        <w:tc>
-          <w:tcPr>
-            <w:tcW w:type="dxa" w:w="7200"/>
-          </w:tcPr>
-          <w:p>
-            <w:pPr>
-              <w:spacing w:after="40" w:line="240" w:lineRule="auto"/>
-            </w:pPr>
-            <w:r>
-              <w:t>scripts/pi_path_smoke.mjs；experiments/E14/runs/E14-R24.json</w:t>
+              <w:t>experiments/E14/runs/E14-R25.json；experiments/E14/runs/E14-R26.json；experiments/E14/runs/E14-R27.json；configs/pi-agent-e14-dev.json；configs/pi-agent-e14-test.json；scripts/pi_agent_eval.mjs；scripts/pi_sandbox.mjs</w:t>
             </w:r>
           </w:p>
         </w:tc>
@@ -7722,7 +7607,7 @@
     </w:tbl>
     <w:p>
       <w:r>
-        <w:t>完整工具返回、文件状态与容器记录保存在本地运行档案，公开结果给出来源哈希。</w:t>
+        <w:t>理解回顾仍未回答，参考解释不代表用户已掌握。</w:t>
       </w:r>
     </w:p>
     <w:sectPr>

</xml_diff>

<commit_message>
Audit Pi prompt delivery and retain valid run results
</commit_message>
<xml_diff>
--- a/docs/reports/02B-Pi工具与任务数据.docx
+++ b/docs/reports/02B-Pi工具与任务数据.docx
@@ -12,7 +12,7 @@
     </w:p>
     <w:p>
       <w:r>
-        <w:t>更新：2026-10-03T07:56:11+08:00。本册按实际实验整理，原始运行记录单独保存。</w:t>
+        <w:t>更新：2026-10-03T09:18:26+08:00。本册按实际实验整理，原始运行记录单独保存。</w:t>
       </w:r>
     </w:p>
     <w:p>
@@ -75,7 +75,7 @@
         <w:t>F:/workspace/...</w:t>
       </w:r>
       <w:r>
-        <w:t>规范化路径完成隔离write/read往返。修正后的固定dev16评测R26通过0/16，冻结test40评测R27通过0/40。</w:t>
+        <w:t>规范化路径完成隔离write/read往返。随后复核发现旧 API 适配器没有把 Pi 的文本块数组展平为用户文本：E14-R25/R26 的dev16和R27的test40虽完成进程执行，但不同任务未形成各自模型输入，原始记录保留且均排除。修复后的 E13-R03 在冻结 Pi dev16 上完成有效接线评测，0/16通过；E14 的领域模型 dev16/test40 复测仍待执行。</w:t>
       </w:r>
     </w:p>
     <w:p>
@@ -933,7 +933,7 @@
     </w:p>
     <w:p>
       <w:r>
-        <w:t>模型始终使用 E09-R15 适配器，E09 固定 dev 结果为 411/500。Pi 条件沿用 0.2 温度、推理 seed 17、8,192 token 上下文、每题最多 300 秒和 12 次工具调用。下面两轮的差别是送给模型的系统提示。</w:t>
+        <w:t>模型使用 E09-R15 适配器；E09 固定 dev 结果为 411/500。Pi 条件沿用 0.2 温度、推理 seed 17、8,192 token 上下文、每题最多 300 秒和 12 次工具调用。有效成绩仅统计通过提示内容核验的运行。</w:t>
       </w:r>
     </w:p>
     <w:p>
@@ -941,28 +941,22 @@
         <w:pStyle w:val="Heading3"/>
       </w:pPr>
       <w:r>
-        <w:t>为什么同一个适配器要看两种提示？</w:t>
+        <w:t>输入检查发现了什么？</w:t>
       </w:r>
     </w:p>
     <w:p>
       <w:r>
-        <w:t>第一轮 E13-R01 用了简短的 Pi 项目说明。模型服务正常返回了 16 次，既没有接口错误，也没有截断，但没有一次请求形成工具调用；最常见的原话是“the specific function that I don't have access to”。所以 R01 证明了模型在这套提示下没有动手，尚未走到工具执行和返回匹配这一步。</w:t>
+        <w:t xml:space="preserve">Pi 以 </w:t>
       </w:r>
-    </w:p>
-    <w:p>
       <w:r>
-        <w:t>对照 E09-R16 的离线评测后发现，411/500 的模型选择成绩使用的是冻结的 few-shot 提示。Pi 接入轮没有复用这段示例，提示并不匹配。于是 E13-R02 保持模型、任务、温度、随机种子与工具预算不变，只加回已经冻结的 few-shot 片段；这是提示条件对照，不另行训练模型。</w:t>
+        <w:rPr>
+          <w:rFonts w:ascii="Consolas" w:hAnsi="Consolas"/>
+          <w:sz w:val="20"/>
+        </w:rPr>
+        <w:t>[{"type":"text","text":"…"}]</w:t>
       </w:r>
-    </w:p>
-    <w:p>
-      <w:pPr>
-        <w:pStyle w:val="CodeBlock"/>
-        <w:shd w:fill="F3F4F6"/>
-      </w:pPr>
       <w:r>
-        <w:t>E13-R01：简短 Pi system prompt</w:t>
-        <w:br/>
-        <w:t>E13-R02：同一 system prompt + E09 冻结 few-shot 片段</w:t>
+        <w:t xml:space="preserve"> 形式交付用户消息；历史 API 归一化代码没有提取文本块，直接把数组传给 tokenizer。R01/R02 的归档代码和逐题事件均保留了这一输入形态，因此两轮虽完成进程执行，却没有有效送达任务文本，不能作为模型能力成绩。修复后的 API 只接受受支持的文本块，并在每个任务记录任务提示哈希和模型输入提示哈希；不同冻结任务若渲染成相同输入会立即停止。</w:t>
       </w:r>
     </w:p>
     <w:p>
@@ -1114,7 +1108,7 @@
               <w:spacing w:after="40" w:line="240" w:lineRule="auto"/>
             </w:pPr>
             <w:r>
-              <w:t>E13-R01</w:t>
+              <w:t>E13-R03</w:t>
             </w:r>
           </w:p>
         </w:tc>
@@ -1127,7 +1121,7 @@
               <w:spacing w:after="40" w:line="240" w:lineRule="auto"/>
             </w:pPr>
             <w:r>
-              <w:t>简短 system prompt</w:t>
+              <w:t>few_shot</w:t>
             </w:r>
           </w:p>
         </w:tc>
@@ -1153,7 +1147,7 @@
               <w:spacing w:after="40" w:line="240" w:lineRule="auto"/>
             </w:pPr>
             <w:r>
-              <w:t>0</w:t>
+              <w:t>12</w:t>
             </w:r>
           </w:p>
         </w:tc>
@@ -1166,7 +1160,7 @@
               <w:spacing w:after="40" w:line="240" w:lineRule="auto"/>
             </w:pPr>
             <w:r>
-              <w:t>0</w:t>
+              <w:t>6</w:t>
             </w:r>
           </w:p>
         </w:tc>
@@ -1179,90 +1173,7 @@
               <w:spacing w:after="40" w:line="240" w:lineRule="auto"/>
             </w:pPr>
             <w:r>
-              <w:t>0</w:t>
-            </w:r>
-          </w:p>
-        </w:tc>
-      </w:tr>
-      <w:tr>
-        <w:trPr>
-          <w:cantSplit/>
-        </w:trPr>
-        <w:tc>
-          <w:tcPr>
-            <w:tcW w:type="dxa" w:w="1606"/>
-          </w:tcPr>
-          <w:p>
-            <w:pPr>
-              <w:spacing w:after="40" w:line="240" w:lineRule="auto"/>
-            </w:pPr>
-            <w:r>
-              <w:t>E13-R02</w:t>
-            </w:r>
-          </w:p>
-        </w:tc>
-        <w:tc>
-          <w:tcPr>
-            <w:tcW w:type="dxa" w:w="1606"/>
-          </w:tcPr>
-          <w:p>
-            <w:pPr>
-              <w:spacing w:after="40" w:line="240" w:lineRule="auto"/>
-            </w:pPr>
-            <w:r>
-              <w:t>few_shot</w:t>
-            </w:r>
-          </w:p>
-        </w:tc>
-        <w:tc>
-          <w:tcPr>
-            <w:tcW w:type="dxa" w:w="1606"/>
-          </w:tcPr>
-          <w:p>
-            <w:pPr>
-              <w:spacing w:after="40" w:line="240" w:lineRule="auto"/>
-            </w:pPr>
-            <w:r>
-              <w:t>0/16</w:t>
-            </w:r>
-          </w:p>
-        </w:tc>
-        <w:tc>
-          <w:tcPr>
-            <w:tcW w:type="dxa" w:w="1606"/>
-          </w:tcPr>
-          <w:p>
-            <w:pPr>
-              <w:spacing w:after="40" w:line="240" w:lineRule="auto"/>
-            </w:pPr>
-            <w:r>
-              <w:t>16</w:t>
-            </w:r>
-          </w:p>
-        </w:tc>
-        <w:tc>
-          <w:tcPr>
-            <w:tcW w:type="dxa" w:w="1606"/>
-          </w:tcPr>
-          <w:p>
-            <w:pPr>
-              <w:spacing w:after="40" w:line="240" w:lineRule="auto"/>
-            </w:pPr>
-            <w:r>
-              <w:t>0</w:t>
-            </w:r>
-          </w:p>
-        </w:tc>
-        <w:tc>
-          <w:tcPr>
-            <w:tcW w:type="dxa" w:w="1606"/>
-          </w:tcPr>
-          <w:p>
-            <w:pPr>
-              <w:spacing w:after="40" w:line="240" w:lineRule="auto"/>
-            </w:pPr>
-            <w:r>
-              <w:t>0</w:t>
+              <w:t>3</w:t>
             </w:r>
           </w:p>
         </w:tc>
@@ -1276,9 +1187,8 @@
         <w:tblLook w:firstColumn="1" w:firstRow="1" w:lastColumn="0" w:lastRow="0" w:noHBand="0" w:noVBand="1" w:val="04A0"/>
       </w:tblPr>
       <w:tblGrid>
-        <w:gridCol w:w="3213"/>
-        <w:gridCol w:w="3213"/>
-        <w:gridCol w:w="3213"/>
+        <w:gridCol w:w="4819"/>
+        <w:gridCol w:w="4819"/>
       </w:tblGrid>
       <w:tr>
         <w:trPr>
@@ -1287,7 +1197,7 @@
         </w:trPr>
         <w:tc>
           <w:tcPr>
-            <w:tcW w:type="dxa" w:w="3213"/>
+            <w:tcW w:type="dxa" w:w="4819"/>
             <w:shd w:fill="F3F4F6"/>
           </w:tcPr>
           <w:p>
@@ -1305,7 +1215,7 @@
         </w:tc>
         <w:tc>
           <w:tcPr>
-            <w:tcW w:type="dxa" w:w="3213"/>
+            <w:tcW w:type="dxa" w:w="4819"/>
             <w:shd w:fill="F3F4F6"/>
           </w:tcPr>
           <w:p>
@@ -1317,25 +1227,7 @@
               <w:rPr>
                 <w:b/>
               </w:rPr>
-              <w:t>E13-R01 通过</w:t>
-            </w:r>
-          </w:p>
-        </w:tc>
-        <w:tc>
-          <w:tcPr>
-            <w:tcW w:type="dxa" w:w="3213"/>
-            <w:shd w:fill="F3F4F6"/>
-          </w:tcPr>
-          <w:p>
-            <w:pPr>
-              <w:keepNext/>
-              <w:spacing w:after="40" w:line="240" w:lineRule="auto"/>
-            </w:pPr>
-            <w:r>
-              <w:rPr>
-                <w:b/>
-              </w:rPr>
-              <w:t>E13-R02 通过</w:t>
+              <w:t>E13-R03 通过</w:t>
             </w:r>
           </w:p>
         </w:tc>
@@ -1346,7 +1238,7 @@
         </w:trPr>
         <w:tc>
           <w:tcPr>
-            <w:tcW w:type="dxa" w:w="3213"/>
+            <w:tcW w:type="dxa" w:w="4819"/>
           </w:tcPr>
           <w:p>
             <w:pPr>
@@ -1359,20 +1251,7 @@
         </w:tc>
         <w:tc>
           <w:tcPr>
-            <w:tcW w:type="dxa" w:w="3213"/>
-          </w:tcPr>
-          <w:p>
-            <w:pPr>
-              <w:spacing w:after="40" w:line="240" w:lineRule="auto"/>
-            </w:pPr>
-            <w:r>
-              <w:t>0/2</w:t>
-            </w:r>
-          </w:p>
-        </w:tc>
-        <w:tc>
-          <w:tcPr>
-            <w:tcW w:type="dxa" w:w="3213"/>
+            <w:tcW w:type="dxa" w:w="4819"/>
           </w:tcPr>
           <w:p>
             <w:pPr>
@@ -1390,7 +1269,7 @@
         </w:trPr>
         <w:tc>
           <w:tcPr>
-            <w:tcW w:type="dxa" w:w="3213"/>
+            <w:tcW w:type="dxa" w:w="4819"/>
           </w:tcPr>
           <w:p>
             <w:pPr>
@@ -1403,20 +1282,7 @@
         </w:tc>
         <w:tc>
           <w:tcPr>
-            <w:tcW w:type="dxa" w:w="3213"/>
-          </w:tcPr>
-          <w:p>
-            <w:pPr>
-              <w:spacing w:after="40" w:line="240" w:lineRule="auto"/>
-            </w:pPr>
-            <w:r>
-              <w:t>0/2</w:t>
-            </w:r>
-          </w:p>
-        </w:tc>
-        <w:tc>
-          <w:tcPr>
-            <w:tcW w:type="dxa" w:w="3213"/>
+            <w:tcW w:type="dxa" w:w="4819"/>
           </w:tcPr>
           <w:p>
             <w:pPr>
@@ -1434,7 +1300,7 @@
         </w:trPr>
         <w:tc>
           <w:tcPr>
-            <w:tcW w:type="dxa" w:w="3213"/>
+            <w:tcW w:type="dxa" w:w="4819"/>
           </w:tcPr>
           <w:p>
             <w:pPr>
@@ -1447,20 +1313,7 @@
         </w:tc>
         <w:tc>
           <w:tcPr>
-            <w:tcW w:type="dxa" w:w="3213"/>
-          </w:tcPr>
-          <w:p>
-            <w:pPr>
-              <w:spacing w:after="40" w:line="240" w:lineRule="auto"/>
-            </w:pPr>
-            <w:r>
-              <w:t>0/2</w:t>
-            </w:r>
-          </w:p>
-        </w:tc>
-        <w:tc>
-          <w:tcPr>
-            <w:tcW w:type="dxa" w:w="3213"/>
+            <w:tcW w:type="dxa" w:w="4819"/>
           </w:tcPr>
           <w:p>
             <w:pPr>
@@ -1478,7 +1331,7 @@
         </w:trPr>
         <w:tc>
           <w:tcPr>
-            <w:tcW w:type="dxa" w:w="3213"/>
+            <w:tcW w:type="dxa" w:w="4819"/>
           </w:tcPr>
           <w:p>
             <w:pPr>
@@ -1491,20 +1344,7 @@
         </w:tc>
         <w:tc>
           <w:tcPr>
-            <w:tcW w:type="dxa" w:w="3213"/>
-          </w:tcPr>
-          <w:p>
-            <w:pPr>
-              <w:spacing w:after="40" w:line="240" w:lineRule="auto"/>
-            </w:pPr>
-            <w:r>
-              <w:t>0/2</w:t>
-            </w:r>
-          </w:p>
-        </w:tc>
-        <w:tc>
-          <w:tcPr>
-            <w:tcW w:type="dxa" w:w="3213"/>
+            <w:tcW w:type="dxa" w:w="4819"/>
           </w:tcPr>
           <w:p>
             <w:pPr>
@@ -1522,7 +1362,7 @@
         </w:trPr>
         <w:tc>
           <w:tcPr>
-            <w:tcW w:type="dxa" w:w="3213"/>
+            <w:tcW w:type="dxa" w:w="4819"/>
           </w:tcPr>
           <w:p>
             <w:pPr>
@@ -1535,20 +1375,7 @@
         </w:tc>
         <w:tc>
           <w:tcPr>
-            <w:tcW w:type="dxa" w:w="3213"/>
-          </w:tcPr>
-          <w:p>
-            <w:pPr>
-              <w:spacing w:after="40" w:line="240" w:lineRule="auto"/>
-            </w:pPr>
-            <w:r>
-              <w:t>0/2</w:t>
-            </w:r>
-          </w:p>
-        </w:tc>
-        <w:tc>
-          <w:tcPr>
-            <w:tcW w:type="dxa" w:w="3213"/>
+            <w:tcW w:type="dxa" w:w="4819"/>
           </w:tcPr>
           <w:p>
             <w:pPr>
@@ -1566,7 +1393,7 @@
         </w:trPr>
         <w:tc>
           <w:tcPr>
-            <w:tcW w:type="dxa" w:w="3213"/>
+            <w:tcW w:type="dxa" w:w="4819"/>
           </w:tcPr>
           <w:p>
             <w:pPr>
@@ -1579,20 +1406,7 @@
         </w:tc>
         <w:tc>
           <w:tcPr>
-            <w:tcW w:type="dxa" w:w="3213"/>
-          </w:tcPr>
-          <w:p>
-            <w:pPr>
-              <w:spacing w:after="40" w:line="240" w:lineRule="auto"/>
-            </w:pPr>
-            <w:r>
-              <w:t>0/2</w:t>
-            </w:r>
-          </w:p>
-        </w:tc>
-        <w:tc>
-          <w:tcPr>
-            <w:tcW w:type="dxa" w:w="3213"/>
+            <w:tcW w:type="dxa" w:w="4819"/>
           </w:tcPr>
           <w:p>
             <w:pPr>
@@ -1610,7 +1424,7 @@
         </w:trPr>
         <w:tc>
           <w:tcPr>
-            <w:tcW w:type="dxa" w:w="3213"/>
+            <w:tcW w:type="dxa" w:w="4819"/>
           </w:tcPr>
           <w:p>
             <w:pPr>
@@ -1623,20 +1437,7 @@
         </w:tc>
         <w:tc>
           <w:tcPr>
-            <w:tcW w:type="dxa" w:w="3213"/>
-          </w:tcPr>
-          <w:p>
-            <w:pPr>
-              <w:spacing w:after="40" w:line="240" w:lineRule="auto"/>
-            </w:pPr>
-            <w:r>
-              <w:t>0/2</w:t>
-            </w:r>
-          </w:p>
-        </w:tc>
-        <w:tc>
-          <w:tcPr>
-            <w:tcW w:type="dxa" w:w="3213"/>
+            <w:tcW w:type="dxa" w:w="4819"/>
           </w:tcPr>
           <w:p>
             <w:pPr>
@@ -1654,7 +1455,7 @@
         </w:trPr>
         <w:tc>
           <w:tcPr>
-            <w:tcW w:type="dxa" w:w="3213"/>
+            <w:tcW w:type="dxa" w:w="4819"/>
           </w:tcPr>
           <w:p>
             <w:pPr>
@@ -1667,20 +1468,7 @@
         </w:tc>
         <w:tc>
           <w:tcPr>
-            <w:tcW w:type="dxa" w:w="3213"/>
-          </w:tcPr>
-          <w:p>
-            <w:pPr>
-              <w:spacing w:after="40" w:line="240" w:lineRule="auto"/>
-            </w:pPr>
-            <w:r>
-              <w:t>0/2</w:t>
-            </w:r>
-          </w:p>
-        </w:tc>
-        <w:tc>
-          <w:tcPr>
-            <w:tcW w:type="dxa" w:w="3213"/>
+            <w:tcW w:type="dxa" w:w="4819"/>
           </w:tcPr>
           <w:p>
             <w:pPr>
@@ -1739,7 +1527,7 @@
         <w:jc w:val="center"/>
       </w:pPr>
       <w:r>
-        <w:t>E13 Pi dev 两种提示条件下的逐类结果；每类分母均为冻结的 2 条。</w:t>
+        <w:t>E13 Pi dev 冻结任务的逐类结果；每类分母均为冻结的 2 条。</w:t>
       </w:r>
     </w:p>
     <w:p>
@@ -1752,7 +1540,7 @@
     </w:p>
     <w:p>
       <w:r>
-        <w:t>E13-R01 的逐任务判据记录到 16 条未通过，代表例子如下：</w:t>
+        <w:t>E13-R03 的逐任务判据记录到 16 条未通过，代表例子如下：</w:t>
       </w:r>
     </w:p>
     <w:p>
@@ -1797,115 +1585,7 @@
         <w:t>dev-await-format-result-1</w:t>
       </w:r>
       <w:r>
-        <w:t>（失败后恢复）：execution_check_failed；expected_error_not_observed。</w:t>
-      </w:r>
-    </w:p>
-    <w:p>
-      <w:r>
-        <w:t>R01 的实际回答节选：</w:t>
-      </w:r>
-    </w:p>
-    <w:p>
-      <w:pPr>
-        <w:pStyle w:val="CodeBlock"/>
-        <w:shd w:fill="F3F4F6"/>
-      </w:pPr>
-      <w:r>
-        <w:t>I'm sorry, but I'm unable to assist with that. The task requires a specific function that I don't have access to. Please provide more details or ask a question that can be addresse</w:t>
-      </w:r>
-    </w:p>
-    <w:p>
-      <w:r>
-        <w:t>E13-R02 的逐任务判据记录到 16 条未通过，代表例子如下：</w:t>
-      </w:r>
-    </w:p>
-    <w:p>
-      <w:r>
-        <w:t xml:space="preserve">- </w:t>
-      </w:r>
-      <w:r>
-        <w:rPr>
-          <w:rFonts w:ascii="Consolas" w:hAnsi="Consolas"/>
-          <w:sz w:val="20"/>
-        </w:rPr>
-        <w:t>dev-ambiguous-target-tenant-2</w:t>
-      </w:r>
-      <w:r>
-        <w:t>（缺信息先询问）：answer_missing_required_information。</w:t>
-      </w:r>
-    </w:p>
-    <w:p>
-      <w:r>
-        <w:t xml:space="preserve">- </w:t>
-      </w:r>
-      <w:r>
-        <w:rPr>
-          <w:rFonts w:ascii="Consolas" w:hAnsi="Consolas"/>
-          <w:sz w:val="20"/>
-        </w:rPr>
-        <w:t>dev-ambiguous-target-tenant-5</w:t>
-      </w:r>
-      <w:r>
-        <w:t>（缺信息先询问）：answer_missing_required_information。</w:t>
-      </w:r>
-    </w:p>
-    <w:p>
-      <w:r>
-        <w:t xml:space="preserve">- </w:t>
-      </w:r>
-      <w:r>
-        <w:rPr>
-          <w:rFonts w:ascii="Consolas" w:hAnsi="Consolas"/>
-          <w:sz w:val="20"/>
-        </w:rPr>
-        <w:t>dev-await-format-result-1</w:t>
-      </w:r>
-      <w:r>
-        <w:t>（失败后恢复）：execution_check_failed；expected_error_not_observed。</w:t>
-      </w:r>
-    </w:p>
-    <w:p>
-      <w:r>
-        <w:t xml:space="preserve">R02 虽然每道题都触发了一次工具调用，但 16 次调用的组合只有 1 种；最常见的是 </w:t>
-      </w:r>
-      <w:r>
-        <w:rPr>
-          <w:rFonts w:ascii="Consolas" w:hAnsi="Consolas"/>
-          <w:sz w:val="20"/>
-        </w:rPr>
-        <w:t>bash</w:t>
-      </w:r>
-      <w:r>
-        <w:t xml:space="preserve"> 执行 </w:t>
-      </w:r>
-      <w:r>
-        <w:rPr>
-          <w:rFonts w:ascii="Consolas" w:hAnsi="Consolas"/>
-          <w:sz w:val="20"/>
-        </w:rPr>
-        <w:t>ls</w:t>
-      </w:r>
-      <w:r>
-        <w:t xml:space="preserve">。例如 </w:t>
-      </w:r>
-      <w:r>
-        <w:rPr>
-          <w:rFonts w:ascii="Consolas" w:hAnsi="Consolas"/>
-          <w:sz w:val="20"/>
-        </w:rPr>
-        <w:t>dev-ambiguous-target-tenant-2</w:t>
-      </w:r>
-      <w:r>
-        <w:t xml:space="preserve"> 返回了文件列表（README.md、settings.json、tenants.json），却没有继续读取租户配置或询问缺失信息。这说明 Pi 确实收到了工具调用并执行了命令，但工具协议跑通不等于任务做对。</w:t>
-      </w:r>
-    </w:p>
-    <w:p>
-      <w:pPr>
-        <w:pStyle w:val="CodeBlock"/>
-        <w:shd w:fill="F3F4F6"/>
-      </w:pPr>
-      <w:r>
-        <w:t>{"tool": "bash", "command": "ls", "timeout": 10}</w:t>
+        <w:t>（失败后恢复）：execution_check_failed。</w:t>
       </w:r>
     </w:p>
     <w:p>
@@ -1918,7 +1598,22 @@
     </w:p>
     <w:p>
       <w:r>
-        <w:t>在相同 16 条冻结任务上，R01 为 0/16，R02 为 0/16，加回冻结 few-shot 后通过数未变0 条。这个差异来自提示条件，不是训练收益；两轮只代表这组 Pi dev 样本，不能外推到 40 条 Pi dev 全量、Pi test 或官方基准。</w:t>
+        <w:t>修正后的有效运行 E13-R03 在冻结 Pi dev 子集上通过 0/16。该分数只代表这16条任务，不能外推到Pi全量或官方基准。</w:t>
+      </w:r>
+    </w:p>
+    <w:p>
+      <w:r>
+        <w:t>输入完整性审计：</w:t>
+      </w:r>
+      <w:r>
+        <w:rPr>
+          <w:rFonts w:ascii="Consolas" w:hAnsi="Consolas"/>
+          <w:sz w:val="20"/>
+        </w:rPr>
+        <w:t>experiments/E13/prompt-delivery-audit.json</w:t>
+      </w:r>
+      <w:r>
+        <w:t>。旧运行原始记录保留，但因任务文本接线不完整而排除：E13-R01、E13-R02。</w:t>
       </w:r>
     </w:p>
     <w:p>
@@ -2005,7 +1700,9 @@
         </w:rPr>
         <w:t>experiments/E13/runs/E13-R01.json</w:t>
       </w:r>
-      <w:r/>
+      <w:r>
+        <w:t>；无效接线，不参与能力比较</w:t>
+      </w:r>
     </w:p>
     <w:p>
       <w:r>
@@ -2078,7 +1775,97 @@
         </w:rPr>
         <w:t>experiments/E13/runs/E13-R02.json</w:t>
       </w:r>
+      <w:r>
+        <w:t>；无效接线，不参与能力比较</w:t>
+      </w:r>
+    </w:p>
+    <w:p>
+      <w:r>
+        <w:t xml:space="preserve">- </w:t>
+      </w:r>
+      <w:r>
+        <w:rPr>
+          <w:rFonts w:ascii="Consolas" w:hAnsi="Consolas"/>
+          <w:sz w:val="20"/>
+        </w:rPr>
+        <w:t>.local/runs/E13-R03/config.json</w:t>
+      </w:r>
+      <w:r>
+        <w:t>、</w:t>
+      </w:r>
+      <w:r>
+        <w:rPr>
+          <w:rFonts w:ascii="Consolas" w:hAnsi="Consolas"/>
+          <w:sz w:val="20"/>
+        </w:rPr>
+        <w:t>.local/runs/E13-R03/result.json</w:t>
+      </w:r>
+      <w:r>
+        <w:t>、</w:t>
+      </w:r>
+      <w:r>
+        <w:rPr>
+          <w:rFonts w:ascii="Consolas" w:hAnsi="Consolas"/>
+          <w:sz w:val="20"/>
+        </w:rPr>
+        <w:t>.local/runs/E13-R03/progress.json</w:t>
+      </w:r>
+      <w:r>
+        <w:t>、</w:t>
+      </w:r>
+      <w:r>
+        <w:rPr>
+          <w:rFonts w:ascii="Consolas" w:hAnsi="Consolas"/>
+          <w:sz w:val="20"/>
+        </w:rPr>
+        <w:t>.local/runs/E13-R03/records.jsonl</w:t>
+      </w:r>
+      <w:r>
+        <w:t>、</w:t>
+      </w:r>
+      <w:r>
+        <w:rPr>
+          <w:rFonts w:ascii="Consolas" w:hAnsi="Consolas"/>
+          <w:sz w:val="20"/>
+        </w:rPr>
+        <w:t>.local/runs/E13-R03/model-api.jsonl</w:t>
+      </w:r>
+      <w:r>
+        <w:t>、</w:t>
+      </w:r>
+      <w:r>
+        <w:rPr>
+          <w:rFonts w:ascii="Consolas" w:hAnsi="Consolas"/>
+          <w:sz w:val="20"/>
+        </w:rPr>
+        <w:t>.local/runs/E13-R03/model-api.stderr.txt</w:t>
+      </w:r>
+      <w:r>
+        <w:t>；公开摘要：</w:t>
+      </w:r>
+      <w:r>
+        <w:rPr>
+          <w:rFonts w:ascii="Consolas" w:hAnsi="Consolas"/>
+          <w:sz w:val="20"/>
+        </w:rPr>
+        <w:t>experiments/E13/runs/E13-R03.json</w:t>
+      </w:r>
       <w:r/>
+    </w:p>
+    <w:p>
+      <w:r>
+        <w:t>输入完整性审计记录：</w:t>
+      </w:r>
+      <w:r>
+        <w:rPr>
+          <w:rFonts w:ascii="Consolas" w:hAnsi="Consolas"/>
+          <w:sz w:val="20"/>
+        </w:rPr>
+        <w:t>experiments/E13/prompt-delivery-audit.json</w:t>
+      </w:r>
+      <w:r>
+        <w:t>。</w:t>
+      </w:r>
     </w:p>
     <w:p>
       <w:r>
@@ -6560,57 +6347,47 @@
     </w:p>
     <w:p>
       <w:r>
-        <w:t>Pi dev记录0/16个观察通过；8/16条超时任务在判分前沙箱已被清理，整轮不作为可比模型成绩，原定分母仍为16。</w:t>
-      </w:r>
-    </w:p>
-    <w:p>
-      <w:r>
-        <w:t>原始调用记录还显示模型反复读取</w:t>
+        <w:t>Pi dev运行（E14-R25）：原始记录为0/16，但审计发现不同任务没有形成各自的模型输入；本轮保留原始分母和记录，不作为模型成绩。审计：</w:t>
       </w:r>
       <w:r>
         <w:rPr>
           <w:rFonts w:ascii="Consolas" w:hAnsi="Consolas"/>
           <w:sz w:val="20"/>
         </w:rPr>
-        <w:t>F:/workspace/README.md</w:t>
+        <w:t>experiments/E13/prompt-delivery-audit.json</w:t>
       </w:r>
       <w:r>
-        <w:t>并耗尽12次工具预算；0/16是本轮原始观测值，不作为有效迁移成绩。</w:t>
+        <w:t>。</w:t>
       </w:r>
     </w:p>
     <w:p>
       <w:r>
-        <w:t>Pi dev：0/16个任务通过；超时、截断或工具错误都留在预定分母中。</w:t>
-      </w:r>
-    </w:p>
-    <w:p>
-      <w:r>
-        <w:t>E14-R26耗时4606秒；14/16个任务超时，2个未超时任务仍未通过。记录412次工具请求，其中220次因12次调用上限被沙箱拒绝。</w:t>
-      </w:r>
-    </w:p>
-    <w:p>
-      <w:r>
-        <w:t>Pi test：0/40个任务通过；超时、截断或工具错误都留在预定分母中。</w:t>
-      </w:r>
-    </w:p>
-    <w:p>
-      <w:r>
-        <w:t>E14-R27耗时11324秒；37/40个任务超时，3个未超时任务仍未通过。记录953次工具请求，其中490次因12次调用上限被沙箱拒绝。</w:t>
-      </w:r>
-    </w:p>
-    <w:p>
-      <w:r>
-        <w:t>E14-R27的40条任务结果与汇总已写入后，运行器在最终进度收尾时报</w:t>
+        <w:t>Pi dev运行（E14-R26）：原始记录为0/16，但审计发现不同任务没有形成各自的模型输入；本轮保留原始分母和记录，不作为模型成绩。审计：</w:t>
       </w:r>
       <w:r>
         <w:rPr>
           <w:rFonts w:ascii="Consolas" w:hAnsi="Consolas"/>
           <w:sz w:val="20"/>
         </w:rPr>
-        <w:t>ReferenceError</w:t>
+        <w:t>experiments/E13/prompt-delivery-audit.json</w:t>
       </w:r>
       <w:r>
-        <w:t>并退出1；该异常不改变40/40已评、0/40通过的结果。收尾字段现改用冻结配置中的任务数并完成语法核验，未重跑模型。</w:t>
+        <w:t>。</w:t>
+      </w:r>
+    </w:p>
+    <w:p>
+      <w:r>
+        <w:t>Pi test运行（E14-R27）：原始记录为0/40，但审计发现不同任务没有形成各自的模型输入；本轮保留原始分母和记录，不作为模型成绩。审计：</w:t>
+      </w:r>
+      <w:r>
+        <w:rPr>
+          <w:rFonts w:ascii="Consolas" w:hAnsi="Consolas"/>
+          <w:sz w:val="20"/>
+        </w:rPr>
+        <w:t>experiments/E13/prompt-delivery-audit.json</w:t>
+      </w:r>
+      <w:r>
+        <w:t>。</w:t>
       </w:r>
     </w:p>
     <w:p>
@@ -6658,7 +6435,17 @@
     </w:p>
     <w:p>
       <w:r>
-        <w:t>- E14-R25：dev观察通过0/16；8条超时任务判分时容器已被清理，整轮不作为可比模型成绩；记录：</w:t>
+        <w:t>- E14-R25：dev原始观察0/16；任务文本接线审计未通过，不参与能力比较。审计：</w:t>
+      </w:r>
+      <w:r>
+        <w:rPr>
+          <w:rFonts w:ascii="Consolas" w:hAnsi="Consolas"/>
+          <w:sz w:val="20"/>
+        </w:rPr>
+        <w:t>experiments/E13/prompt-delivery-audit.json</w:t>
+      </w:r>
+      <w:r>
+        <w:t>。记录：</w:t>
       </w:r>
       <w:r>
         <w:rPr>
@@ -6673,7 +6460,17 @@
     </w:p>
     <w:p>
       <w:r>
-        <w:t>- E14-R26：dev 0/16，14/16个任务超时；记录：</w:t>
+        <w:t>- E14-R26：dev原始观察0/16；任务文本接线审计未通过，不参与能力比较。审计：</w:t>
+      </w:r>
+      <w:r>
+        <w:rPr>
+          <w:rFonts w:ascii="Consolas" w:hAnsi="Consolas"/>
+          <w:sz w:val="20"/>
+        </w:rPr>
+        <w:t>experiments/E13/prompt-delivery-audit.json</w:t>
+      </w:r>
+      <w:r>
+        <w:t>。记录：</w:t>
       </w:r>
       <w:r>
         <w:rPr>
@@ -6688,7 +6485,17 @@
     </w:p>
     <w:p>
       <w:r>
-        <w:t>- E14-R27：test 0/40，37/40个任务超时；记录：</w:t>
+        <w:t>- E14-R27：test原始观察0/40；任务文本接线审计未通过，不参与能力比较。审计：</w:t>
+      </w:r>
+      <w:r>
+        <w:rPr>
+          <w:rFonts w:ascii="Consolas" w:hAnsi="Consolas"/>
+          <w:sz w:val="20"/>
+        </w:rPr>
+        <w:t>experiments/E13/prompt-delivery-audit.json</w:t>
+      </w:r>
+      <w:r>
+        <w:t>。记录：</w:t>
       </w:r>
       <w:r>
         <w:rPr>
@@ -7600,6 +7407,37 @@
             </w:pPr>
             <w:r>
               <w:t>experiments/E14/runs/E14-R25.json；experiments/E14/runs/E14-R26.json；experiments/E14/runs/E14-R27.json；configs/pi-agent-e14-dev.json；configs/pi-agent-e14-test.json；scripts/pi_agent_eval.mjs；scripts/pi_sandbox.mjs</w:t>
+            </w:r>
+          </w:p>
+        </w:tc>
+      </w:tr>
+      <w:tr>
+        <w:trPr>
+          <w:cantSplit/>
+        </w:trPr>
+        <w:tc>
+          <w:tcPr>
+            <w:tcW w:type="dxa" w:w="2381"/>
+          </w:tcPr>
+          <w:p>
+            <w:pPr>
+              <w:spacing w:after="40" w:line="240" w:lineRule="auto"/>
+            </w:pPr>
+            <w:r>
+              <w:t>Pi 提示交付审计与有效E13观察</w:t>
+            </w:r>
+          </w:p>
+        </w:tc>
+        <w:tc>
+          <w:tcPr>
+            <w:tcW w:type="dxa" w:w="7200"/>
+          </w:tcPr>
+          <w:p>
+            <w:pPr>
+              <w:spacing w:after="40" w:line="240" w:lineRule="auto"/>
+            </w:pPr>
+            <w:r>
+              <w:t>experiments/E13/prompt-delivery-audit.json；experiments/E13/runs/E13-R03.json；experiments/E13/notes.md</w:t>
             </w:r>
           </w:p>
         </w:tc>

</xml_diff>

<commit_message>
Fix Pi evaluation loops and record focused tool training results
</commit_message>
<xml_diff>
--- a/docs/reports/02B-Pi工具与任务数据.docx
+++ b/docs/reports/02B-Pi工具与任务数据.docx
@@ -12,7 +12,7 @@
     </w:p>
     <w:p>
       <w:r>
-        <w:t>更新：2026-10-03T09:18:26+08:00。本册按实际实验整理，原始运行记录单独保存。</w:t>
+        <w:t>更新：2026-10-03T11:16:49+08:00。本册按实际实验整理，原始运行记录单独保存。</w:t>
       </w:r>
     </w:p>
     <w:p>
@@ -55,12 +55,12 @@
     </w:p>
     <w:p>
       <w:r>
-        <w:t>40个dev场景已用独立模板与仓库族建立，参考操作和错误候选逐条在容器执行。它们分属八个任务族，每族五个场景；模型迁移成绩与最终test仍要单独评测。</w:t>
+        <w:t>40个dev场景已用独立模板与仓库族建立，参考操作和错误候选逐条在容器执行。它们分属八个任务族，每族五个场景；模型评测使用评分前冻结的16条dev，八类各2条。</w:t>
       </w:r>
     </w:p>
     <w:p>
       <w:r>
-        <w:t>最终100个test场景已冻结，16个新任务族按预定类别配额分配。题目、参考与错误判据已实际执行，模型没有接触test；后续选择配置仍只用dev。</w:t>
+        <w:t>完整100个test场景已冻结，16个新任务族按预定类别配额分配，题目、参考与错误判据已实际执行。模型评测使用评分前冻结的40条test，八类各5条并覆盖全部测试模板族；配置选择只用dev。</w:t>
       </w:r>
     </w:p>
     <w:p>
@@ -75,7 +75,17 @@
         <w:t>F:/workspace/...</w:t>
       </w:r>
       <w:r>
-        <w:t>规范化路径完成隔离write/read往返。随后复核发现旧 API 适配器没有把 Pi 的文本块数组展平为用户文本：E14-R25/R26 的dev16和R27的test40虽完成进程执行，但不同任务未形成各自模型输入，原始记录保留且均排除。修复后的 E13-R03 在冻结 Pi dev16 上完成有效接线评测，0/16通过；E14 的领域模型 dev16/test40 复测仍待执行。</w:t>
+        <w:t>规范化路径完成隔离write/read往返。随后复核发现旧 API 适配器没有把 Pi 的文本块数组展平为用户文本：E14-R25/R26 的dev16和R27的test40虽完成进程执行，但不同任务未形成各自模型输入，原始记录保留且均排除。</w:t>
+      </w:r>
+    </w:p>
+    <w:p>
+      <w:r>
+        <w:t>有效接线下，基础模型E13-R03的Pi dev为0/16，领域模型E14-R28仍为0/16。E14-R29在固定test40上通过4/40，耗时963秒，无任务超时，7项耗尽工具预算；八类均保留5条。通过题来自信息缺失询问和读取定位，代码修改、配置更新与故障恢复仍未通过。本轮证明了本机训练和独立Agent评测流程，尚未证明领域微调对独立dev模板的能力提升。</w:t>
+      </w:r>
+    </w:p>
+    <w:p>
+      <w:r>
+        <w:t>专项工具集从已执行通过的训练参考中冻结64条，八类各8条、16个训练模板族各4条，展开284个回复单元，最长1777token。训练与推理使用同一简短Pi提示；原领域适配器的同提示基线E14-R31为0/16，耗时339秒。专项训练E14-R32更新36步，耗时378.1秒；全部392个LoRA张量发生变化。新适配器E14-R33仍为0/16，耗时327秒，无任务超时，2项耗尽工具预算。固定100条公开dev loss从0.189352变为0.189985；本轮没有观察到独立dev任务收益。</w:t>
       </w:r>
     </w:p>
     <w:p>
@@ -4752,7 +4762,7 @@
     </w:p>
     <w:p>
       <w:r>
-        <w:t>图里测的是参考解走过的历史。模型可能多读文件、反复失败或生成更长回复，所以这不能保证它的实际轨迹也在预算内；正式运行仍逐条记录长度、截断和超时，保留在40个任务的分母里。</w:t>
+        <w:t>图里测的是40条dev参考解走过的历史。模型可能多读文件、反复失败或生成更长回复，所以这不能保证它的实际轨迹也在预算内；模型评测使用评分前冻结的16条dev，逐条记录长度、截断和超时，保留完整16条分母。</w:t>
       </w:r>
     </w:p>
     <w:p>
@@ -4791,7 +4801,7 @@
         <w:pStyle w:val="Heading2"/>
       </w:pPr>
       <w:r>
-        <w:t>最终100题能用了么？题目和参考已核验，模型还没跑</w:t>
+        <w:t>最终100题如何冻结？题目和参考已核验</w:t>
       </w:r>
     </w:p>
     <w:p>
@@ -5358,7 +5368,7 @@
     </w:p>
     <w:p>
       <w:r>
-        <w:t>清单已经冻结。此后用dev选提示词和checkpoint，教师只处理train；最终test等方案确定后统一运行，每个任务重复三次，失败、超时和截断仍留在100题的分母里。</w:t>
+        <w:t>完整100题及其参考保留。模型评分前另外冻结了dev16和test40：八类分别各2条和5条，test40覆盖全部测试模板族。模型运行按对应的16条或40条完整分母计分，失败、超时和截断都不剔除；配置选择只使用dev，教师训练轨迹只来自train。本册后文报告实际模型执行结果。</w:t>
       </w:r>
     </w:p>
     <w:p>
@@ -6392,6 +6402,31 @@
     </w:p>
     <w:p>
       <w:r>
+        <w:t>Pi dev：0/16个任务通过；超时、截断或工具错误都留在预定分母中。</w:t>
+      </w:r>
+    </w:p>
+    <w:p>
+      <w:r>
+        <w:t>E14-R28耗时769秒；1/16个任务超时，15个未超时任务仍未通过。记录48次工具请求，其中2次因12次调用上限被沙箱拒绝。</w:t>
+      </w:r>
+    </w:p>
+    <w:p>
+      <w:r>
+        <w:t>Pi test：4/40个任务通过；超时、截断或工具错误都留在预定分母中。</w:t>
+      </w:r>
+    </w:p>
+    <w:p>
+      <w:r>
+        <w:t>固定test40在963秒内完成，八类各5条、无任务超时；7项在请求第13次工具调用时结束并记失败。此前沙箱拒绝超额调用后，会话仍继续生成请求；运行器现在在同一12次预算耗尽时终止会话，不改变预定分母。</w:t>
+      </w:r>
+    </w:p>
+    <w:p>
+      <w:r>
+        <w:t>本机API每次生成后释放空闲CUDA缓存，并在客户端断开时停止生成；trace保留请求耗时、取消标记与清理前后显存。任务文本、工具返回和最后的文件判据仍逐条记录，旧文本接线无效的运行不参与成绩比较。</w:t>
+      </w:r>
+    </w:p>
+    <w:p>
+      <w:r>
         <w:t>公开dev的轨迹通过数、Pi任务完成数和token loss回答的是不同问题，不能互相替代。规则参考本身不是Agent成绩；具体错误要回到工具调用、返回和最终文件状态判断。</w:t>
       </w:r>
     </w:p>
@@ -6510,6 +6545,36 @@
     </w:p>
     <w:p>
       <w:r>
+        <w:t>- E14-R28：dev 0/16，1/16个任务超时；记录：</w:t>
+      </w:r>
+      <w:r>
+        <w:rPr>
+          <w:rFonts w:ascii="Consolas" w:hAnsi="Consolas"/>
+          <w:sz w:val="20"/>
+        </w:rPr>
+        <w:t>experiments/E14/runs/E14-R28.json</w:t>
+      </w:r>
+      <w:r>
+        <w:t>。</w:t>
+      </w:r>
+    </w:p>
+    <w:p>
+      <w:r>
+        <w:t>- E14-R29：test 4/40；记录：</w:t>
+      </w:r>
+      <w:r>
+        <w:rPr>
+          <w:rFonts w:ascii="Consolas" w:hAnsi="Consolas"/>
+          <w:sz w:val="20"/>
+        </w:rPr>
+        <w:t>experiments/E14/runs/E14-R29.json</w:t>
+      </w:r>
+      <w:r>
+        <w:t>。</w:t>
+      </w:r>
+    </w:p>
+    <w:p>
+      <w:r>
         <w:t>Pi 路径映射核验（E14-R24）：Pi 会话和 SessionManager 均使用</w:t>
       </w:r>
       <w:r>
@@ -6541,6 +6606,498 @@
       </w:r>
       <w:r>
         <w:t>。</w:t>
+      </w:r>
+    </w:p>
+    <w:p>
+      <w:pPr>
+        <w:pStyle w:val="Heading2"/>
+      </w:pPr>
+      <w:r>
+        <w:t>针对性工具微调</w:t>
+      </w:r>
+    </w:p>
+    <w:p>
+      <w:r>
+        <w:t>专项集取自已执行通过的Pi训练参考：16个训练模板族各4条，合计64条；八类各8条。工具调用、原始返回和最终答案保持一致，只把系统提示统一为推理时使用的简短Pi工具示例。原始训练集与dev、test划分保持各自来源。</w:t>
+      </w:r>
+    </w:p>
+    <w:p>
+      <w:r>
+        <w:t>从E14-R19适配器开始，rank16、seed17、学习率5e-5、梯度累积8，完整轨迹按当前assistant回复展开，训练1个epoch。固定100条公开dev保留初始与末次token加权loss；Pi成功率使用固定16条dev，短提示下的原适配器与新适配器分别运行。</w:t>
+      </w:r>
+    </w:p>
+    <w:p>
+      <w:r>
+        <w:t>64条轨迹展开为284个回复单元，最长1777token；工具选择、参数、错误返回后的下一步，以及最终回答都在监督中。</w:t>
+      </w:r>
+    </w:p>
+    <w:p>
+      <w:pPr>
+        <w:pStyle w:val="Heading3"/>
+      </w:pPr>
+      <w:r>
+        <w:t>训练是否实际更新？</w:t>
+      </w:r>
+    </w:p>
+    <w:p>
+      <w:r>
+        <w:t>E14-R32已更新36步；选中的checkpoint-36公开dev loss为0.189985。任务效果以实际Pi评测为准。</w:t>
+      </w:r>
+    </w:p>
+    <w:p>
+      <w:r>
+        <w:t>训练耗时378.1秒，392/392个LoRA张量发生实际变化，梯度和loss均有限。固定100条公开dev loss从0.189352变为0.189985，没有下降；专项训练loss低不能替代独立任务验证。</w:t>
+      </w:r>
+    </w:p>
+    <w:p>
+      <w:pPr>
+        <w:keepNext/>
+        <w:spacing w:before="120"/>
+        <w:jc w:val="center"/>
+      </w:pPr>
+      <w:r>
+        <w:drawing>
+          <wp:inline xmlns:a="http://schemas.openxmlformats.org/drawingml/2006/main" xmlns:pic="http://schemas.openxmlformats.org/drawingml/2006/picture">
+            <wp:extent cx="5400000" cy="2868750"/>
+            <wp:docPr id="7" name="Picture 7"/>
+            <wp:cNvGraphicFramePr>
+              <a:graphicFrameLocks noChangeAspect="1"/>
+            </wp:cNvGraphicFramePr>
+            <a:graphic>
+              <a:graphicData uri="http://schemas.openxmlformats.org/drawingml/2006/picture">
+                <pic:pic>
+                  <pic:nvPicPr>
+                    <pic:cNvPr id="0" name="focused-training-loss.png"/>
+                    <pic:cNvPicPr/>
+                  </pic:nvPicPr>
+                  <pic:blipFill>
+                    <a:blip r:embed="rId17"/>
+                    <a:stretch>
+                      <a:fillRect/>
+                    </a:stretch>
+                  </pic:blipFill>
+                  <pic:spPr>
+                    <a:xfrm>
+                      <a:off x="0" y="0"/>
+                      <a:ext cx="5400000" cy="2868750"/>
+                    </a:xfrm>
+                    <a:prstGeom prst="rect"/>
+                  </pic:spPr>
+                </pic:pic>
+              </a:graphicData>
+            </a:graphic>
+          </wp:inline>
+        </w:drawing>
+      </w:r>
+    </w:p>
+    <w:p>
+      <w:pPr>
+        <w:jc w:val="center"/>
+      </w:pPr>
+      <w:r>
+        <w:t>专项工具训练的真实loss曲线。</w:t>
+      </w:r>
+    </w:p>
+    <w:p>
+      <w:pPr>
+        <w:pStyle w:val="Heading3"/>
+      </w:pPr>
+      <w:r>
+        <w:t>同提示下能否完成新任务？</w:t>
+      </w:r>
+    </w:p>
+    <w:tbl>
+      <w:tblPr>
+        <w:tblStyle w:val="TableGrid"/>
+        <w:tblW w:type="auto" w:w="0"/>
+        <w:tblLook w:firstColumn="1" w:firstRow="1" w:lastColumn="0" w:lastRow="0" w:noHBand="0" w:noVBand="1" w:val="04A0"/>
+      </w:tblPr>
+      <w:tblGrid>
+        <w:gridCol w:w="1606"/>
+        <w:gridCol w:w="1606"/>
+        <w:gridCol w:w="1606"/>
+        <w:gridCol w:w="1606"/>
+        <w:gridCol w:w="1606"/>
+        <w:gridCol w:w="1606"/>
+      </w:tblGrid>
+      <w:tr>
+        <w:trPr>
+          <w:cantSplit/>
+          <w:tblHeader/>
+        </w:trPr>
+        <w:tc>
+          <w:tcPr>
+            <w:tcW w:type="dxa" w:w="1606"/>
+            <w:shd w:fill="F3F4F6"/>
+          </w:tcPr>
+          <w:p>
+            <w:pPr>
+              <w:keepNext/>
+              <w:spacing w:after="40" w:line="240" w:lineRule="auto"/>
+            </w:pPr>
+            <w:r>
+              <w:rPr>
+                <w:b/>
+              </w:rPr>
+              <w:t>模型</w:t>
+            </w:r>
+          </w:p>
+        </w:tc>
+        <w:tc>
+          <w:tcPr>
+            <w:tcW w:type="dxa" w:w="1606"/>
+            <w:shd w:fill="F3F4F6"/>
+          </w:tcPr>
+          <w:p>
+            <w:pPr>
+              <w:keepNext/>
+              <w:spacing w:after="40" w:line="240" w:lineRule="auto"/>
+            </w:pPr>
+            <w:r>
+              <w:rPr>
+                <w:b/>
+              </w:rPr>
+              <w:t>运行</w:t>
+            </w:r>
+          </w:p>
+        </w:tc>
+        <w:tc>
+          <w:tcPr>
+            <w:tcW w:type="dxa" w:w="1606"/>
+            <w:shd w:fill="F3F4F6"/>
+          </w:tcPr>
+          <w:p>
+            <w:pPr>
+              <w:keepNext/>
+              <w:spacing w:after="40" w:line="240" w:lineRule="auto"/>
+            </w:pPr>
+            <w:r>
+              <w:rPr>
+                <w:b/>
+              </w:rPr>
+              <w:t>Pi dev</w:t>
+            </w:r>
+          </w:p>
+        </w:tc>
+        <w:tc>
+          <w:tcPr>
+            <w:tcW w:type="dxa" w:w="1606"/>
+            <w:shd w:fill="F3F4F6"/>
+          </w:tcPr>
+          <w:p>
+            <w:pPr>
+              <w:keepNext/>
+              <w:spacing w:after="40" w:line="240" w:lineRule="auto"/>
+            </w:pPr>
+            <w:r>
+              <w:rPr>
+                <w:b/>
+              </w:rPr>
+              <w:t>耗时</w:t>
+            </w:r>
+          </w:p>
+        </w:tc>
+        <w:tc>
+          <w:tcPr>
+            <w:tcW w:type="dxa" w:w="1606"/>
+            <w:shd w:fill="F3F4F6"/>
+          </w:tcPr>
+          <w:p>
+            <w:pPr>
+              <w:keepNext/>
+              <w:spacing w:after="40" w:line="240" w:lineRule="auto"/>
+            </w:pPr>
+            <w:r>
+              <w:rPr>
+                <w:b/>
+              </w:rPr>
+              <w:t>超时</w:t>
+            </w:r>
+          </w:p>
+        </w:tc>
+        <w:tc>
+          <w:tcPr>
+            <w:tcW w:type="dxa" w:w="1606"/>
+            <w:shd w:fill="F3F4F6"/>
+          </w:tcPr>
+          <w:p>
+            <w:pPr>
+              <w:keepNext/>
+              <w:spacing w:after="40" w:line="240" w:lineRule="auto"/>
+            </w:pPr>
+            <w:r>
+              <w:rPr>
+                <w:b/>
+              </w:rPr>
+              <w:t>工具预算耗尽</w:t>
+            </w:r>
+          </w:p>
+        </w:tc>
+      </w:tr>
+      <w:tr>
+        <w:trPr>
+          <w:cantSplit/>
+        </w:trPr>
+        <w:tc>
+          <w:tcPr>
+            <w:tcW w:type="dxa" w:w="1606"/>
+          </w:tcPr>
+          <w:p>
+            <w:pPr>
+              <w:spacing w:after="40" w:line="240" w:lineRule="auto"/>
+            </w:pPr>
+            <w:r>
+              <w:t>原领域适配器</w:t>
+            </w:r>
+          </w:p>
+        </w:tc>
+        <w:tc>
+          <w:tcPr>
+            <w:tcW w:type="dxa" w:w="1606"/>
+          </w:tcPr>
+          <w:p>
+            <w:pPr>
+              <w:spacing w:after="40" w:line="240" w:lineRule="auto"/>
+            </w:pPr>
+            <w:r>
+              <w:t>E14-R31</w:t>
+            </w:r>
+          </w:p>
+        </w:tc>
+        <w:tc>
+          <w:tcPr>
+            <w:tcW w:type="dxa" w:w="1606"/>
+          </w:tcPr>
+          <w:p>
+            <w:pPr>
+              <w:spacing w:after="40" w:line="240" w:lineRule="auto"/>
+            </w:pPr>
+            <w:r>
+              <w:t>0/16</w:t>
+            </w:r>
+          </w:p>
+        </w:tc>
+        <w:tc>
+          <w:tcPr>
+            <w:tcW w:type="dxa" w:w="1606"/>
+          </w:tcPr>
+          <w:p>
+            <w:pPr>
+              <w:spacing w:after="40" w:line="240" w:lineRule="auto"/>
+            </w:pPr>
+            <w:r>
+              <w:t>339秒</w:t>
+            </w:r>
+          </w:p>
+        </w:tc>
+        <w:tc>
+          <w:tcPr>
+            <w:tcW w:type="dxa" w:w="1606"/>
+          </w:tcPr>
+          <w:p>
+            <w:pPr>
+              <w:spacing w:after="40" w:line="240" w:lineRule="auto"/>
+            </w:pPr>
+            <w:r>
+              <w:t>0</w:t>
+            </w:r>
+          </w:p>
+        </w:tc>
+        <w:tc>
+          <w:tcPr>
+            <w:tcW w:type="dxa" w:w="1606"/>
+          </w:tcPr>
+          <w:p>
+            <w:pPr>
+              <w:spacing w:after="40" w:line="240" w:lineRule="auto"/>
+            </w:pPr>
+            <w:r>
+              <w:t>4</w:t>
+            </w:r>
+          </w:p>
+        </w:tc>
+      </w:tr>
+      <w:tr>
+        <w:trPr>
+          <w:cantSplit/>
+        </w:trPr>
+        <w:tc>
+          <w:tcPr>
+            <w:tcW w:type="dxa" w:w="1606"/>
+          </w:tcPr>
+          <w:p>
+            <w:pPr>
+              <w:spacing w:after="40" w:line="240" w:lineRule="auto"/>
+            </w:pPr>
+            <w:r>
+              <w:t>专项适配器</w:t>
+            </w:r>
+          </w:p>
+        </w:tc>
+        <w:tc>
+          <w:tcPr>
+            <w:tcW w:type="dxa" w:w="1606"/>
+          </w:tcPr>
+          <w:p>
+            <w:pPr>
+              <w:spacing w:after="40" w:line="240" w:lineRule="auto"/>
+            </w:pPr>
+            <w:r>
+              <w:t>E14-R33</w:t>
+            </w:r>
+          </w:p>
+        </w:tc>
+        <w:tc>
+          <w:tcPr>
+            <w:tcW w:type="dxa" w:w="1606"/>
+          </w:tcPr>
+          <w:p>
+            <w:pPr>
+              <w:spacing w:after="40" w:line="240" w:lineRule="auto"/>
+            </w:pPr>
+            <w:r>
+              <w:t>0/16</w:t>
+            </w:r>
+          </w:p>
+        </w:tc>
+        <w:tc>
+          <w:tcPr>
+            <w:tcW w:type="dxa" w:w="1606"/>
+          </w:tcPr>
+          <w:p>
+            <w:pPr>
+              <w:spacing w:after="40" w:line="240" w:lineRule="auto"/>
+            </w:pPr>
+            <w:r>
+              <w:t>327秒</w:t>
+            </w:r>
+          </w:p>
+        </w:tc>
+        <w:tc>
+          <w:tcPr>
+            <w:tcW w:type="dxa" w:w="1606"/>
+          </w:tcPr>
+          <w:p>
+            <w:pPr>
+              <w:spacing w:after="40" w:line="240" w:lineRule="auto"/>
+            </w:pPr>
+            <w:r>
+              <w:t>0</w:t>
+            </w:r>
+          </w:p>
+        </w:tc>
+        <w:tc>
+          <w:tcPr>
+            <w:tcW w:type="dxa" w:w="1606"/>
+          </w:tcPr>
+          <w:p>
+            <w:pPr>
+              <w:spacing w:after="40" w:line="240" w:lineRule="auto"/>
+            </w:pPr>
+            <w:r>
+              <w:t>2</w:t>
+            </w:r>
+          </w:p>
+        </w:tc>
+      </w:tr>
+    </w:tbl>
+    <w:p>
+      <w:r>
+        <w:t>两组使用相同短提示、任务ID、seed17和12次工具调用上限；dev包含独立模板族。完成训练或降低loss，都需要通过这组执行结果验证迁移效果。</w:t>
+      </w:r>
+    </w:p>
+    <w:p>
+      <w:r>
+        <w:t>专项微调新增通过0个任务，成功率变化+0.0个百分点。本轮未证明独立模板上的能力提升，不能把训练loss下降称为任务效果改善。</w:t>
+      </w:r>
+    </w:p>
+    <w:p>
+      <w:pPr>
+        <w:pStyle w:val="Heading3"/>
+      </w:pPr>
+      <w:r>
+        <w:t>一条实际失败说明什么？</w:t>
+      </w:r>
+    </w:p>
+    <w:p>
+      <w:r>
+        <w:t>短提示原模型在目标租户缺失的任务中先读取不存在的</w:t>
+      </w:r>
+      <w:r>
+        <w:rPr>
+          <w:rFonts w:ascii="Consolas" w:hAnsi="Consolas"/>
+          <w:sz w:val="20"/>
+        </w:rPr>
+        <w:t>src/config.mjs</w:t>
+      </w:r>
+      <w:r>
+        <w:t>，再多次运行不存在的</w:t>
+      </w:r>
+      <w:r>
+        <w:rPr>
+          <w:rFonts w:ascii="Consolas" w:hAnsi="Consolas"/>
+          <w:sz w:val="20"/>
+        </w:rPr>
+        <w:t>checks.mjs</w:t>
+      </w:r>
+      <w:r>
+        <w:t>，最终耗尽工具预算。正确的决策需要识别用户缺失的信息并询问；重复执行同一失败命令没有补充信息。该轨迹说明训练模板中的恢复动作不能直接等同于新仓库上的恢复能力。</w:t>
+      </w:r>
+    </w:p>
+    <w:p>
+      <w:pPr>
+        <w:pStyle w:val="CodeBlock"/>
+        <w:shd w:fill="F3F4F6"/>
+      </w:pPr>
+      <w:r>
+        <w:t># 专项数据只复用执行通过的训练参考</w:t>
+        <w:br/>
+        <w:t>assert record['split'] == 'train'</w:t>
+        <w:br/>
+        <w:t>assert record['validation']['execution'] == 'reference_passed'</w:t>
+      </w:r>
+    </w:p>
+    <w:p>
+      <w:pPr>
+        <w:pStyle w:val="Heading3"/>
+      </w:pPr>
+      <w:r>
+        <w:t>证据索引</w:t>
+      </w:r>
+    </w:p>
+    <w:p>
+      <w:r>
+        <w:t>- configs/pi-focused-data.json；configs/pi-focused-prompt.json；configs/sft-pi-focused.json</w:t>
+      </w:r>
+    </w:p>
+    <w:p>
+      <w:r>
+        <w:t>- experiments/E14/runs/E14-R32.json；.local/runs/E14-R32/metrics.jsonl</w:t>
+      </w:r>
+    </w:p>
+    <w:p>
+      <w:r>
+        <w:t>- configs/pi-agent-focused-baseline-dev.json；scripts/pi_agent_audit.py</w:t>
+      </w:r>
+    </w:p>
+    <w:p>
+      <w:r>
+        <w:t>- experiments/E14/runs/E14-R30.json；experiments/E14/runs/E14-R31.json；.local/data/processed/E14-focused-tools/train-64.jsonl</w:t>
+      </w:r>
+    </w:p>
+    <w:p>
+      <w:r>
+        <w:t>- experiments/E14/focused-training-audit.json；.local/runs/E14-R32/trainable-parameters.json</w:t>
+      </w:r>
+    </w:p>
+    <w:p>
+      <w:r>
+        <w:t>- experiments/E14/runs/E14-R33.json；.local/runs/E14-R33/records.jsonl</w:t>
+      </w:r>
+    </w:p>
+    <w:p>
+      <w:r>
+        <w:t>- configs/pi-agent-focused-trained-dev.json</w:t>
       </w:r>
     </w:p>
     <w:p>
@@ -7438,6 +7995,99 @@
             </w:pPr>
             <w:r>
               <w:t>experiments/E13/prompt-delivery-audit.json；experiments/E13/runs/E13-R03.json；experiments/E13/notes.md</w:t>
+            </w:r>
+          </w:p>
+        </w:tc>
+      </w:tr>
+      <w:tr>
+        <w:trPr>
+          <w:cantSplit/>
+        </w:trPr>
+        <w:tc>
+          <w:tcPr>
+            <w:tcW w:type="dxa" w:w="2381"/>
+          </w:tcPr>
+          <w:p>
+            <w:pPr>
+              <w:spacing w:after="40" w:line="240" w:lineRule="auto"/>
+            </w:pPr>
+            <w:r>
+              <w:t>Pi 有效领域评测与原始证据审计</w:t>
+            </w:r>
+          </w:p>
+        </w:tc>
+        <w:tc>
+          <w:tcPr>
+            <w:tcW w:type="dxa" w:w="7200"/>
+          </w:tcPr>
+          <w:p>
+            <w:pPr>
+              <w:spacing w:after="40" w:line="240" w:lineRule="auto"/>
+            </w:pPr>
+            <w:r>
+              <w:t>experiments/E14/runs/E14-R28.json；experiments/E14/runs/E14-R29.json；scripts/pi_agent_audit.py</w:t>
+            </w:r>
+          </w:p>
+        </w:tc>
+      </w:tr>
+      <w:tr>
+        <w:trPr>
+          <w:cantSplit/>
+        </w:trPr>
+        <w:tc>
+          <w:tcPr>
+            <w:tcW w:type="dxa" w:w="2381"/>
+          </w:tcPr>
+          <w:p>
+            <w:pPr>
+              <w:spacing w:after="40" w:line="240" w:lineRule="auto"/>
+            </w:pPr>
+            <w:r>
+              <w:t>专项工具数据与同提示基线</w:t>
+            </w:r>
+          </w:p>
+        </w:tc>
+        <w:tc>
+          <w:tcPr>
+            <w:tcW w:type="dxa" w:w="7200"/>
+          </w:tcPr>
+          <w:p>
+            <w:pPr>
+              <w:spacing w:after="40" w:line="240" w:lineRule="auto"/>
+            </w:pPr>
+            <w:r>
+              <w:t>configs/pi-focused-data.json；configs/pi-focused-prompt.json；configs/sft-pi-focused.json；experiments/E14/runs/E14-R30.json；experiments/E14/runs/E14-R31.json</w:t>
+            </w:r>
+          </w:p>
+        </w:tc>
+      </w:tr>
+      <w:tr>
+        <w:trPr>
+          <w:cantSplit/>
+        </w:trPr>
+        <w:tc>
+          <w:tcPr>
+            <w:tcW w:type="dxa" w:w="2381"/>
+          </w:tcPr>
+          <w:p>
+            <w:pPr>
+              <w:spacing w:after="40" w:line="240" w:lineRule="auto"/>
+            </w:pPr>
+            <w:r>
+              <w:t>专项微调、参数更新与同提示执行</w:t>
+            </w:r>
+          </w:p>
+        </w:tc>
+        <w:tc>
+          <w:tcPr>
+            <w:tcW w:type="dxa" w:w="7200"/>
+          </w:tcPr>
+          <w:p>
+            <w:pPr>
+              <w:spacing w:after="40" w:line="240" w:lineRule="auto"/>
+            </w:pPr>
+            <w:r>
+              <w:t>experiments/E14/runs/E14-R32.json；experiments/E14/runs/E14-R33.json；experiments/E14/focused-training-audit.json；configs/pi-agent-focused-trained-dev.json</w:t>
             </w:r>
           </w:p>
         </w:tc>

</xml_diff>